<commit_message>
NH housing v1.1: supplement 2020-2024 with 23 bills from year-end official indexes (NHMA/OPD/NH Housing/NH Bulletin); corrected brief (158 bills, 48 laws; supply reforms began 2024; SB406 shelter precedent; SB454); rebuilt pack/map/appendices; 2pp re-verified
Co-authored-by: CaptainWrechols <CaptainWrechols@users.noreply.github.com>
</commit_message>
<xml_diff>
--- a/briefs/new-hampshire/housing-affordability/citizen-v1/appendices/appendices.docx
+++ b/briefs/new-hampshire/housing-affordability/citizen-v1/appendices/appendices.docx
@@ -24,19 +24,25 @@
         <w:pStyle w:val="FirstParagraph"/>
       </w:pPr>
       <w:r>
-        <w:t xml:space="preserve">Long-form detail behind the two-page citizen front brief. 149 bills were</w:t>
+        <w:t xml:space="preserve">Long-form detail behind the two-page citizen front brief. 172 bills are in</w:t>
       </w:r>
       <w:r>
         <w:t xml:space="preserve"> </w:t>
       </w:r>
       <w:r>
-        <w:t xml:space="preserve">found for 2020–2026; 135 policy bills carry the headline numbers (13 context</w:t>
+        <w:t xml:space="preserve">the set for 2020–2026 (keyword discovery plus a documented supplement from</w:t>
       </w:r>
       <w:r>
         <w:t xml:space="preserve"> </w:t>
       </w:r>
       <w:r>
-        <w:t xml:space="preserve">bills and one biennium-carryover duplicate are kept for audit).</w:t>
+        <w:t xml:space="preserve">year-end official indexes); 158 policy bills carry the headline numbers (13</w:t>
+      </w:r>
+      <w:r>
+        <w:t xml:space="preserve"> </w:t>
+      </w:r>
+      <w:r>
+        <w:t xml:space="preserve">context bills and one biennium-carryover duplicate are kept for audit).</w:t>
       </w:r>
     </w:p>
     <w:tbl>
@@ -824,6 +830,74 @@
               <w:pStyle w:val="Compact"/>
             </w:pPr>
             <w:r>
+              <w:t xml:space="preserve">SB721</w:t>
+            </w:r>
+          </w:p>
+        </w:tc>
+        <w:tc>
+          <w:tcPr/>
+          <w:p>
+            <w:pPr>
+              <w:pStyle w:val="Compact"/>
+            </w:pPr>
+            <w:r>
+              <w:t xml:space="preserve">Would have replaced the new Housing Appeals Board with court review of planning board appeals.</w:t>
+            </w:r>
+          </w:p>
+        </w:tc>
+        <w:tc>
+          <w:tcPr/>
+          <w:p>
+            <w:pPr>
+              <w:pStyle w:val="Compact"/>
+            </w:pPr>
+            <w:r>
+              <w:t xml:space="preserve">Land use boards, appeals, and the courts</w:t>
+            </w:r>
+          </w:p>
+        </w:tc>
+        <w:tc>
+          <w:tcPr/>
+          <w:p>
+            <w:pPr>
+              <w:pStyle w:val="Compact"/>
+            </w:pPr>
+            <w:r>
+              <w:t xml:space="preserve">Did not pass</w:t>
+            </w:r>
+          </w:p>
+        </w:tc>
+        <w:tc>
+          <w:tcPr/>
+          <w:p>
+            <w:pPr>
+              <w:pStyle w:val="Compact"/>
+            </w:pPr>
+            <w:r>
+              <w:t xml:space="preserve">core</w:t>
+            </w:r>
+          </w:p>
+        </w:tc>
+      </w:tr>
+      <w:tr>
+        <w:tc>
+          <w:tcPr/>
+          <w:p>
+            <w:pPr>
+              <w:pStyle w:val="Compact"/>
+            </w:pPr>
+            <w:r>
+              <w:t xml:space="preserve">2020</w:t>
+            </w:r>
+          </w:p>
+        </w:tc>
+        <w:tc>
+          <w:tcPr/>
+          <w:p>
+            <w:pPr>
+              <w:pStyle w:val="Compact"/>
+            </w:pPr>
+            <w:r>
               <w:t xml:space="preserve">SB726</w:t>
             </w:r>
           </w:p>
@@ -881,6 +955,74 @@
               <w:pStyle w:val="Compact"/>
             </w:pPr>
             <w:r>
+              <w:t xml:space="preserve">2020</w:t>
+            </w:r>
+          </w:p>
+        </w:tc>
+        <w:tc>
+          <w:tcPr/>
+          <w:p>
+            <w:pPr>
+              <w:pStyle w:val="Compact"/>
+            </w:pPr>
+            <w:r>
+              <w:t xml:space="preserve">SB735</w:t>
+            </w:r>
+          </w:p>
+        </w:tc>
+        <w:tc>
+          <w:tcPr/>
+          <w:p>
+            <w:pPr>
+              <w:pStyle w:val="Compact"/>
+            </w:pPr>
+            <w:r>
+              <w:t xml:space="preserve">Would have repealed the Housing Appeals Board in its first year.</w:t>
+            </w:r>
+          </w:p>
+        </w:tc>
+        <w:tc>
+          <w:tcPr/>
+          <w:p>
+            <w:pPr>
+              <w:pStyle w:val="Compact"/>
+            </w:pPr>
+            <w:r>
+              <w:t xml:space="preserve">Land use boards, appeals, and the courts</w:t>
+            </w:r>
+          </w:p>
+        </w:tc>
+        <w:tc>
+          <w:tcPr/>
+          <w:p>
+            <w:pPr>
+              <w:pStyle w:val="Compact"/>
+            </w:pPr>
+            <w:r>
+              <w:t xml:space="preserve">Did not pass</w:t>
+            </w:r>
+          </w:p>
+        </w:tc>
+        <w:tc>
+          <w:tcPr/>
+          <w:p>
+            <w:pPr>
+              <w:pStyle w:val="Compact"/>
+            </w:pPr>
+            <w:r>
+              <w:t xml:space="preserve">core</w:t>
+            </w:r>
+          </w:p>
+        </w:tc>
+      </w:tr>
+      <w:tr>
+        <w:tc>
+          <w:tcPr/>
+          <w:p>
+            <w:pPr>
+              <w:pStyle w:val="Compact"/>
+            </w:pPr>
+            <w:r>
               <w:t xml:space="preserve">2021</w:t>
             </w:r>
           </w:p>
@@ -960,6 +1102,278 @@
               <w:pStyle w:val="Compact"/>
             </w:pPr>
             <w:r>
+              <w:t xml:space="preserve">HB284</w:t>
+            </w:r>
+          </w:p>
+        </w:tc>
+        <w:tc>
+          <w:tcPr/>
+          <w:p>
+            <w:pPr>
+              <w:pStyle w:val="Compact"/>
+            </w:pPr>
+            <w:r>
+              <w:t xml:space="preserve">Removed the deadline for restoring involuntarily merged residential lots.</w:t>
+            </w:r>
+          </w:p>
+        </w:tc>
+        <w:tc>
+          <w:tcPr/>
+          <w:p>
+            <w:pPr>
+              <w:pStyle w:val="Compact"/>
+            </w:pPr>
+            <w:r>
+              <w:t xml:space="preserve">Building more homes: zoning and land use</w:t>
+            </w:r>
+          </w:p>
+        </w:tc>
+        <w:tc>
+          <w:tcPr/>
+          <w:p>
+            <w:pPr>
+              <w:pStyle w:val="Compact"/>
+            </w:pPr>
+            <w:r>
+              <w:t xml:space="preserve">Became law</w:t>
+            </w:r>
+          </w:p>
+        </w:tc>
+        <w:tc>
+          <w:tcPr/>
+          <w:p>
+            <w:pPr>
+              <w:pStyle w:val="Compact"/>
+            </w:pPr>
+            <w:r>
+              <w:t xml:space="preserve">adjacent</w:t>
+            </w:r>
+          </w:p>
+        </w:tc>
+      </w:tr>
+      <w:tr>
+        <w:tc>
+          <w:tcPr/>
+          <w:p>
+            <w:pPr>
+              <w:pStyle w:val="Compact"/>
+            </w:pPr>
+            <w:r>
+              <w:t xml:space="preserve">2021</w:t>
+            </w:r>
+          </w:p>
+        </w:tc>
+        <w:tc>
+          <w:tcPr/>
+          <w:p>
+            <w:pPr>
+              <w:pStyle w:val="Compact"/>
+            </w:pPr>
+            <w:r>
+              <w:t xml:space="preserve">HB286</w:t>
+            </w:r>
+          </w:p>
+        </w:tc>
+        <w:tc>
+          <w:tcPr/>
+          <w:p>
+            <w:pPr>
+              <w:pStyle w:val="Compact"/>
+            </w:pPr>
+            <w:r>
+              <w:t xml:space="preserve">Created a study committee on law enforcement’s response to homelessness.</w:t>
+            </w:r>
+          </w:p>
+        </w:tc>
+        <w:tc>
+          <w:tcPr/>
+          <w:p>
+            <w:pPr>
+              <w:pStyle w:val="Compact"/>
+            </w:pPr>
+            <w:r>
+              <w:t xml:space="preserve">Homelessness and housing stability</w:t>
+            </w:r>
+          </w:p>
+        </w:tc>
+        <w:tc>
+          <w:tcPr/>
+          <w:p>
+            <w:pPr>
+              <w:pStyle w:val="Compact"/>
+            </w:pPr>
+            <w:r>
+              <w:t xml:space="preserve">Became law</w:t>
+            </w:r>
+          </w:p>
+        </w:tc>
+        <w:tc>
+          <w:tcPr/>
+          <w:p>
+            <w:pPr>
+              <w:pStyle w:val="Compact"/>
+            </w:pPr>
+            <w:r>
+              <w:t xml:space="preserve">adjacent</w:t>
+            </w:r>
+          </w:p>
+        </w:tc>
+      </w:tr>
+      <w:tr>
+        <w:tc>
+          <w:tcPr/>
+          <w:p>
+            <w:pPr>
+              <w:pStyle w:val="Compact"/>
+            </w:pPr>
+            <w:r>
+              <w:t xml:space="preserve">2021</w:t>
+            </w:r>
+          </w:p>
+        </w:tc>
+        <w:tc>
+          <w:tcPr/>
+          <w:p>
+            <w:pPr>
+              <w:pStyle w:val="Compact"/>
+            </w:pPr>
+            <w:r>
+              <w:t xml:space="preserve">HB332</w:t>
+            </w:r>
+          </w:p>
+        </w:tc>
+        <w:tc>
+          <w:tcPr/>
+          <w:p>
+            <w:pPr>
+              <w:pStyle w:val="Compact"/>
+            </w:pPr>
+            <w:r>
+              <w:t xml:space="preserve">Gave planning boards 30 extra days to act on developments of regional impact.</w:t>
+            </w:r>
+          </w:p>
+        </w:tc>
+        <w:tc>
+          <w:tcPr/>
+          <w:p>
+            <w:pPr>
+              <w:pStyle w:val="Compact"/>
+            </w:pPr>
+            <w:r>
+              <w:t xml:space="preserve">Land use boards, appeals, and the courts</w:t>
+            </w:r>
+          </w:p>
+        </w:tc>
+        <w:tc>
+          <w:tcPr/>
+          <w:p>
+            <w:pPr>
+              <w:pStyle w:val="Compact"/>
+            </w:pPr>
+            <w:r>
+              <w:t xml:space="preserve">Became law</w:t>
+            </w:r>
+          </w:p>
+        </w:tc>
+        <w:tc>
+          <w:tcPr/>
+          <w:p>
+            <w:pPr>
+              <w:pStyle w:val="Compact"/>
+            </w:pPr>
+            <w:r>
+              <w:t xml:space="preserve">adjacent</w:t>
+            </w:r>
+          </w:p>
+        </w:tc>
+      </w:tr>
+      <w:tr>
+        <w:tc>
+          <w:tcPr/>
+          <w:p>
+            <w:pPr>
+              <w:pStyle w:val="Compact"/>
+            </w:pPr>
+            <w:r>
+              <w:t xml:space="preserve">2021</w:t>
+            </w:r>
+          </w:p>
+        </w:tc>
+        <w:tc>
+          <w:tcPr/>
+          <w:p>
+            <w:pPr>
+              <w:pStyle w:val="Compact"/>
+            </w:pPr>
+            <w:r>
+              <w:t xml:space="preserve">HB377</w:t>
+            </w:r>
+          </w:p>
+        </w:tc>
+        <w:tc>
+          <w:tcPr/>
+          <w:p>
+            <w:pPr>
+              <w:pStyle w:val="Compact"/>
+            </w:pPr>
+            <w:r>
+              <w:t xml:space="preserve">Let the state fire marshal exempt recovery houses from certain fire code requirements.</w:t>
+            </w:r>
+          </w:p>
+        </w:tc>
+        <w:tc>
+          <w:tcPr/>
+          <w:p>
+            <w:pPr>
+              <w:pStyle w:val="Compact"/>
+            </w:pPr>
+            <w:r>
+              <w:t xml:space="preserve">Homelessness and housing stability</w:t>
+            </w:r>
+          </w:p>
+        </w:tc>
+        <w:tc>
+          <w:tcPr/>
+          <w:p>
+            <w:pPr>
+              <w:pStyle w:val="Compact"/>
+            </w:pPr>
+            <w:r>
+              <w:t xml:space="preserve">Became law</w:t>
+            </w:r>
+          </w:p>
+        </w:tc>
+        <w:tc>
+          <w:tcPr/>
+          <w:p>
+            <w:pPr>
+              <w:pStyle w:val="Compact"/>
+            </w:pPr>
+            <w:r>
+              <w:t xml:space="preserve">adjacent</w:t>
+            </w:r>
+          </w:p>
+        </w:tc>
+      </w:tr>
+      <w:tr>
+        <w:tc>
+          <w:tcPr/>
+          <w:p>
+            <w:pPr>
+              <w:pStyle w:val="Compact"/>
+            </w:pPr>
+            <w:r>
+              <w:t xml:space="preserve">2021</w:t>
+            </w:r>
+          </w:p>
+        </w:tc>
+        <w:tc>
+          <w:tcPr/>
+          <w:p>
+            <w:pPr>
+              <w:pStyle w:val="Compact"/>
+            </w:pPr>
+            <w:r>
               <w:t xml:space="preserve">HB503</w:t>
             </w:r>
           </w:p>
@@ -1164,6 +1578,74 @@
               <w:pStyle w:val="Compact"/>
             </w:pPr>
             <w:r>
+              <w:t xml:space="preserve">SB102</w:t>
+            </w:r>
+          </w:p>
+        </w:tc>
+        <w:tc>
+          <w:tcPr/>
+          <w:p>
+            <w:pPr>
+              <w:pStyle w:val="Compact"/>
+            </w:pPr>
+            <w:r>
+              <w:t xml:space="preserve">Property-tax omnibus that created community revitalization (79-E) tax relief for housing development.</w:t>
+            </w:r>
+          </w:p>
+        </w:tc>
+        <w:tc>
+          <w:tcPr/>
+          <w:p>
+            <w:pPr>
+              <w:pStyle w:val="Compact"/>
+            </w:pPr>
+            <w:r>
+              <w:t xml:space="preserve">State housing money and programs</w:t>
+            </w:r>
+          </w:p>
+        </w:tc>
+        <w:tc>
+          <w:tcPr/>
+          <w:p>
+            <w:pPr>
+              <w:pStyle w:val="Compact"/>
+            </w:pPr>
+            <w:r>
+              <w:t xml:space="preserve">Became law</w:t>
+            </w:r>
+          </w:p>
+        </w:tc>
+        <w:tc>
+          <w:tcPr/>
+          <w:p>
+            <w:pPr>
+              <w:pStyle w:val="Compact"/>
+            </w:pPr>
+            <w:r>
+              <w:t xml:space="preserve">adjacent</w:t>
+            </w:r>
+          </w:p>
+        </w:tc>
+      </w:tr>
+      <w:tr>
+        <w:tc>
+          <w:tcPr/>
+          <w:p>
+            <w:pPr>
+              <w:pStyle w:val="Compact"/>
+            </w:pPr>
+            <w:r>
+              <w:t xml:space="preserve">2021</w:t>
+            </w:r>
+          </w:p>
+        </w:tc>
+        <w:tc>
+          <w:tcPr/>
+          <w:p>
+            <w:pPr>
+              <w:pStyle w:val="Compact"/>
+            </w:pPr>
+            <w:r>
               <w:t xml:space="preserve">SB126</w:t>
             </w:r>
           </w:p>
@@ -1436,6 +1918,74 @@
               <w:pStyle w:val="Compact"/>
             </w:pPr>
             <w:r>
+              <w:t xml:space="preserve">HB1021</w:t>
+            </w:r>
+          </w:p>
+        </w:tc>
+        <w:tc>
+          <w:tcPr/>
+          <w:p>
+            <w:pPr>
+              <w:pStyle w:val="Compact"/>
+            </w:pPr>
+            <w:r>
+              <w:t xml:space="preserve">Restricted zoning regulation of land or structures used primarily for religious purposes.</w:t>
+            </w:r>
+          </w:p>
+        </w:tc>
+        <w:tc>
+          <w:tcPr/>
+          <w:p>
+            <w:pPr>
+              <w:pStyle w:val="Compact"/>
+            </w:pPr>
+            <w:r>
+              <w:t xml:space="preserve">Building more homes: zoning and land use</w:t>
+            </w:r>
+          </w:p>
+        </w:tc>
+        <w:tc>
+          <w:tcPr/>
+          <w:p>
+            <w:pPr>
+              <w:pStyle w:val="Compact"/>
+            </w:pPr>
+            <w:r>
+              <w:t xml:space="preserve">Became law</w:t>
+            </w:r>
+          </w:p>
+        </w:tc>
+        <w:tc>
+          <w:tcPr/>
+          <w:p>
+            <w:pPr>
+              <w:pStyle w:val="Compact"/>
+            </w:pPr>
+            <w:r>
+              <w:t xml:space="preserve">adjacent</w:t>
+            </w:r>
+          </w:p>
+        </w:tc>
+      </w:tr>
+      <w:tr>
+        <w:tc>
+          <w:tcPr/>
+          <w:p>
+            <w:pPr>
+              <w:pStyle w:val="Compact"/>
+            </w:pPr>
+            <w:r>
+              <w:t xml:space="preserve">2022</w:t>
+            </w:r>
+          </w:p>
+        </w:tc>
+        <w:tc>
+          <w:tcPr/>
+          <w:p>
+            <w:pPr>
+              <w:pStyle w:val="Compact"/>
+            </w:pPr>
+            <w:r>
               <w:t xml:space="preserve">HB1291</w:t>
             </w:r>
           </w:p>
@@ -1504,6 +2054,74 @@
               <w:pStyle w:val="Compact"/>
             </w:pPr>
             <w:r>
+              <w:t xml:space="preserve">HB1661</w:t>
+            </w:r>
+          </w:p>
+        </w:tc>
+        <w:tc>
+          <w:tcPr/>
+          <w:p>
+            <w:pPr>
+              <w:pStyle w:val="Compact"/>
+            </w:pPr>
+            <w:r>
+              <w:t xml:space="preserve">Omnibus bill whose land-use sections made significant changes to planning, zoning, and development rules.</w:t>
+            </w:r>
+          </w:p>
+        </w:tc>
+        <w:tc>
+          <w:tcPr/>
+          <w:p>
+            <w:pPr>
+              <w:pStyle w:val="Compact"/>
+            </w:pPr>
+            <w:r>
+              <w:t xml:space="preserve">Building more homes: zoning and land use</w:t>
+            </w:r>
+          </w:p>
+        </w:tc>
+        <w:tc>
+          <w:tcPr/>
+          <w:p>
+            <w:pPr>
+              <w:pStyle w:val="Compact"/>
+            </w:pPr>
+            <w:r>
+              <w:t xml:space="preserve">Became law</w:t>
+            </w:r>
+          </w:p>
+        </w:tc>
+        <w:tc>
+          <w:tcPr/>
+          <w:p>
+            <w:pPr>
+              <w:pStyle w:val="Compact"/>
+            </w:pPr>
+            <w:r>
+              <w:t xml:space="preserve">core</w:t>
+            </w:r>
+          </w:p>
+        </w:tc>
+      </w:tr>
+      <w:tr>
+        <w:tc>
+          <w:tcPr/>
+          <w:p>
+            <w:pPr>
+              <w:pStyle w:val="Compact"/>
+            </w:pPr>
+            <w:r>
+              <w:t xml:space="preserve">2022</w:t>
+            </w:r>
+          </w:p>
+        </w:tc>
+        <w:tc>
+          <w:tcPr/>
+          <w:p>
+            <w:pPr>
+              <w:pStyle w:val="Compact"/>
+            </w:pPr>
+            <w:r>
               <w:t xml:space="preserve">HB1662</w:t>
             </w:r>
           </w:p>
@@ -1572,6 +2190,142 @@
               <w:pStyle w:val="Compact"/>
             </w:pPr>
             <w:r>
+              <w:t xml:space="preserve">SB223</w:t>
+            </w:r>
+          </w:p>
+        </w:tc>
+        <w:tc>
+          <w:tcPr/>
+          <w:p>
+            <w:pPr>
+              <w:pStyle w:val="Compact"/>
+            </w:pPr>
+            <w:r>
+              <w:t xml:space="preserve">Changed the minimum size of recovery houses.</w:t>
+            </w:r>
+          </w:p>
+        </w:tc>
+        <w:tc>
+          <w:tcPr/>
+          <w:p>
+            <w:pPr>
+              <w:pStyle w:val="Compact"/>
+            </w:pPr>
+            <w:r>
+              <w:t xml:space="preserve">Homelessness and housing stability</w:t>
+            </w:r>
+          </w:p>
+        </w:tc>
+        <w:tc>
+          <w:tcPr/>
+          <w:p>
+            <w:pPr>
+              <w:pStyle w:val="Compact"/>
+            </w:pPr>
+            <w:r>
+              <w:t xml:space="preserve">Became law</w:t>
+            </w:r>
+          </w:p>
+        </w:tc>
+        <w:tc>
+          <w:tcPr/>
+          <w:p>
+            <w:pPr>
+              <w:pStyle w:val="Compact"/>
+            </w:pPr>
+            <w:r>
+              <w:t xml:space="preserve">adjacent</w:t>
+            </w:r>
+          </w:p>
+        </w:tc>
+      </w:tr>
+      <w:tr>
+        <w:tc>
+          <w:tcPr/>
+          <w:p>
+            <w:pPr>
+              <w:pStyle w:val="Compact"/>
+            </w:pPr>
+            <w:r>
+              <w:t xml:space="preserve">2022</w:t>
+            </w:r>
+          </w:p>
+        </w:tc>
+        <w:tc>
+          <w:tcPr/>
+          <w:p>
+            <w:pPr>
+              <w:pStyle w:val="Compact"/>
+            </w:pPr>
+            <w:r>
+              <w:t xml:space="preserve">SB334</w:t>
+            </w:r>
+          </w:p>
+        </w:tc>
+        <w:tc>
+          <w:tcPr/>
+          <w:p>
+            <w:pPr>
+              <w:pStyle w:val="Compact"/>
+            </w:pPr>
+            <w:r>
+              <w:t xml:space="preserve">Created a committee to study property blight in municipalities.</w:t>
+            </w:r>
+          </w:p>
+        </w:tc>
+        <w:tc>
+          <w:tcPr/>
+          <w:p>
+            <w:pPr>
+              <w:pStyle w:val="Compact"/>
+            </w:pPr>
+            <w:r>
+              <w:t xml:space="preserve">Housing studies, plans, and data</w:t>
+            </w:r>
+          </w:p>
+        </w:tc>
+        <w:tc>
+          <w:tcPr/>
+          <w:p>
+            <w:pPr>
+              <w:pStyle w:val="Compact"/>
+            </w:pPr>
+            <w:r>
+              <w:t xml:space="preserve">Became law</w:t>
+            </w:r>
+          </w:p>
+        </w:tc>
+        <w:tc>
+          <w:tcPr/>
+          <w:p>
+            <w:pPr>
+              <w:pStyle w:val="Compact"/>
+            </w:pPr>
+            <w:r>
+              <w:t xml:space="preserve">adjacent</w:t>
+            </w:r>
+          </w:p>
+        </w:tc>
+      </w:tr>
+      <w:tr>
+        <w:tc>
+          <w:tcPr/>
+          <w:p>
+            <w:pPr>
+              <w:pStyle w:val="Compact"/>
+            </w:pPr>
+            <w:r>
+              <w:t xml:space="preserve">2022</w:t>
+            </w:r>
+          </w:p>
+        </w:tc>
+        <w:tc>
+          <w:tcPr/>
+          <w:p>
+            <w:pPr>
+              <w:pStyle w:val="Compact"/>
+            </w:pPr>
+            <w:r>
               <w:t xml:space="preserve">SB400</w:t>
             </w:r>
           </w:p>
@@ -1844,6 +2598,74 @@
               <w:pStyle w:val="Compact"/>
             </w:pPr>
             <w:r>
+              <w:t xml:space="preserve">HB296</w:t>
+            </w:r>
+          </w:p>
+        </w:tc>
+        <w:tc>
+          <w:tcPr/>
+          <w:p>
+            <w:pPr>
+              <w:pStyle w:val="Compact"/>
+            </w:pPr>
+            <w:r>
+              <w:t xml:space="preserve">Altered local authority over residential driveway permits.</w:t>
+            </w:r>
+          </w:p>
+        </w:tc>
+        <w:tc>
+          <w:tcPr/>
+          <w:p>
+            <w:pPr>
+              <w:pStyle w:val="Compact"/>
+            </w:pPr>
+            <w:r>
+              <w:t xml:space="preserve">Building more homes: zoning and land use</w:t>
+            </w:r>
+          </w:p>
+        </w:tc>
+        <w:tc>
+          <w:tcPr/>
+          <w:p>
+            <w:pPr>
+              <w:pStyle w:val="Compact"/>
+            </w:pPr>
+            <w:r>
+              <w:t xml:space="preserve">Became law</w:t>
+            </w:r>
+          </w:p>
+        </w:tc>
+        <w:tc>
+          <w:tcPr/>
+          <w:p>
+            <w:pPr>
+              <w:pStyle w:val="Compact"/>
+            </w:pPr>
+            <w:r>
+              <w:t xml:space="preserve">adjacent</w:t>
+            </w:r>
+          </w:p>
+        </w:tc>
+      </w:tr>
+      <w:tr>
+        <w:tc>
+          <w:tcPr/>
+          <w:p>
+            <w:pPr>
+              <w:pStyle w:val="Compact"/>
+            </w:pPr>
+            <w:r>
+              <w:t xml:space="preserve">2023</w:t>
+            </w:r>
+          </w:p>
+        </w:tc>
+        <w:tc>
+          <w:tcPr/>
+          <w:p>
+            <w:pPr>
+              <w:pStyle w:val="Compact"/>
+            </w:pPr>
+            <w:r>
               <w:t xml:space="preserve">HB401</w:t>
             </w:r>
           </w:p>
@@ -1912,6 +2734,142 @@
               <w:pStyle w:val="Compact"/>
             </w:pPr>
             <w:r>
+              <w:t xml:space="preserve">HB42</w:t>
+            </w:r>
+          </w:p>
+        </w:tc>
+        <w:tc>
+          <w:tcPr/>
+          <w:p>
+            <w:pPr>
+              <w:pStyle w:val="Compact"/>
+            </w:pPr>
+            <w:r>
+              <w:t xml:space="preserve">Expanded land use board authority over homeowners’ associations.</w:t>
+            </w:r>
+          </w:p>
+        </w:tc>
+        <w:tc>
+          <w:tcPr/>
+          <w:p>
+            <w:pPr>
+              <w:pStyle w:val="Compact"/>
+            </w:pPr>
+            <w:r>
+              <w:t xml:space="preserve">Building more homes: zoning and land use</w:t>
+            </w:r>
+          </w:p>
+        </w:tc>
+        <w:tc>
+          <w:tcPr/>
+          <w:p>
+            <w:pPr>
+              <w:pStyle w:val="Compact"/>
+            </w:pPr>
+            <w:r>
+              <w:t xml:space="preserve">Became law</w:t>
+            </w:r>
+          </w:p>
+        </w:tc>
+        <w:tc>
+          <w:tcPr/>
+          <w:p>
+            <w:pPr>
+              <w:pStyle w:val="Compact"/>
+            </w:pPr>
+            <w:r>
+              <w:t xml:space="preserve">adjacent</w:t>
+            </w:r>
+          </w:p>
+        </w:tc>
+      </w:tr>
+      <w:tr>
+        <w:tc>
+          <w:tcPr/>
+          <w:p>
+            <w:pPr>
+              <w:pStyle w:val="Compact"/>
+            </w:pPr>
+            <w:r>
+              <w:t xml:space="preserve">2023</w:t>
+            </w:r>
+          </w:p>
+        </w:tc>
+        <w:tc>
+          <w:tcPr/>
+          <w:p>
+            <w:pPr>
+              <w:pStyle w:val="Compact"/>
+            </w:pPr>
+            <w:r>
+              <w:t xml:space="preserve">HB44</w:t>
+            </w:r>
+          </w:p>
+        </w:tc>
+        <w:tc>
+          <w:tcPr/>
+          <w:p>
+            <w:pPr>
+              <w:pStyle w:val="Compact"/>
+            </w:pPr>
+            <w:r>
+              <w:t xml:space="preserve">Would have allowed four homes by right on single-family lots served by municipal water and sewer.</w:t>
+            </w:r>
+          </w:p>
+        </w:tc>
+        <w:tc>
+          <w:tcPr/>
+          <w:p>
+            <w:pPr>
+              <w:pStyle w:val="Compact"/>
+            </w:pPr>
+            <w:r>
+              <w:t xml:space="preserve">Building more homes: zoning and land use</w:t>
+            </w:r>
+          </w:p>
+        </w:tc>
+        <w:tc>
+          <w:tcPr/>
+          <w:p>
+            <w:pPr>
+              <w:pStyle w:val="Compact"/>
+            </w:pPr>
+            <w:r>
+              <w:t xml:space="preserve">Did not pass</w:t>
+            </w:r>
+          </w:p>
+        </w:tc>
+        <w:tc>
+          <w:tcPr/>
+          <w:p>
+            <w:pPr>
+              <w:pStyle w:val="Compact"/>
+            </w:pPr>
+            <w:r>
+              <w:t xml:space="preserve">core</w:t>
+            </w:r>
+          </w:p>
+        </w:tc>
+      </w:tr>
+      <w:tr>
+        <w:tc>
+          <w:tcPr/>
+          <w:p>
+            <w:pPr>
+              <w:pStyle w:val="Compact"/>
+            </w:pPr>
+            <w:r>
+              <w:t xml:space="preserve">2023</w:t>
+            </w:r>
+          </w:p>
+        </w:tc>
+        <w:tc>
+          <w:tcPr/>
+          <w:p>
+            <w:pPr>
+              <w:pStyle w:val="Compact"/>
+            </w:pPr>
+            <w:r>
               <w:t xml:space="preserve">HB469</w:t>
             </w:r>
           </w:p>
@@ -2309,6 +3267,74 @@
               <w:pStyle w:val="Compact"/>
             </w:pPr>
             <w:r>
+              <w:t xml:space="preserve">2023</w:t>
+            </w:r>
+          </w:p>
+        </w:tc>
+        <w:tc>
+          <w:tcPr/>
+          <w:p>
+            <w:pPr>
+              <w:pStyle w:val="Compact"/>
+            </w:pPr>
+            <w:r>
+              <w:t xml:space="preserve">SB231</w:t>
+            </w:r>
+          </w:p>
+        </w:tc>
+        <w:tc>
+          <w:tcPr/>
+          <w:p>
+            <w:pPr>
+              <w:pStyle w:val="Compact"/>
+            </w:pPr>
+            <w:r>
+              <w:t xml:space="preserve">Workforce and affordable housing appropriations (with a proposed historic housing tax credit); its appropriations were enacted through the HB2 budget trailer.</w:t>
+            </w:r>
+          </w:p>
+        </w:tc>
+        <w:tc>
+          <w:tcPr/>
+          <w:p>
+            <w:pPr>
+              <w:pStyle w:val="Compact"/>
+            </w:pPr>
+            <w:r>
+              <w:t xml:space="preserve">State housing money and programs</w:t>
+            </w:r>
+          </w:p>
+        </w:tc>
+        <w:tc>
+          <w:tcPr/>
+          <w:p>
+            <w:pPr>
+              <w:pStyle w:val="Compact"/>
+            </w:pPr>
+            <w:r>
+              <w:t xml:space="preserve">Enacted via HB2</w:t>
+            </w:r>
+          </w:p>
+        </w:tc>
+        <w:tc>
+          <w:tcPr/>
+          <w:p>
+            <w:pPr>
+              <w:pStyle w:val="Compact"/>
+            </w:pPr>
+            <w:r>
+              <w:t xml:space="preserve">core</w:t>
+            </w:r>
+          </w:p>
+        </w:tc>
+      </w:tr>
+      <w:tr>
+        <w:tc>
+          <w:tcPr/>
+          <w:p>
+            <w:pPr>
+              <w:pStyle w:val="Compact"/>
+            </w:pPr>
+            <w:r>
               <w:t xml:space="preserve">2024</w:t>
             </w:r>
           </w:p>
@@ -2320,6 +3346,74 @@
               <w:pStyle w:val="Compact"/>
             </w:pPr>
             <w:r>
+              <w:t xml:space="preserve">HB1065</w:t>
+            </w:r>
+          </w:p>
+        </w:tc>
+        <w:tc>
+          <w:tcPr/>
+          <w:p>
+            <w:pPr>
+              <w:pStyle w:val="Compact"/>
+            </w:pPr>
+            <w:r>
+              <w:t xml:space="preserve">Extended the sprinkler exemption to three- and four-family homes and barred stricter local sprinkler codes.</w:t>
+            </w:r>
+          </w:p>
+        </w:tc>
+        <w:tc>
+          <w:tcPr/>
+          <w:p>
+            <w:pPr>
+              <w:pStyle w:val="Compact"/>
+            </w:pPr>
+            <w:r>
+              <w:t xml:space="preserve">Building more homes: zoning and land use</w:t>
+            </w:r>
+          </w:p>
+        </w:tc>
+        <w:tc>
+          <w:tcPr/>
+          <w:p>
+            <w:pPr>
+              <w:pStyle w:val="Compact"/>
+            </w:pPr>
+            <w:r>
+              <w:t xml:space="preserve">Became law</w:t>
+            </w:r>
+          </w:p>
+        </w:tc>
+        <w:tc>
+          <w:tcPr/>
+          <w:p>
+            <w:pPr>
+              <w:pStyle w:val="Compact"/>
+            </w:pPr>
+            <w:r>
+              <w:t xml:space="preserve">adjacent</w:t>
+            </w:r>
+          </w:p>
+        </w:tc>
+      </w:tr>
+      <w:tr>
+        <w:tc>
+          <w:tcPr/>
+          <w:p>
+            <w:pPr>
+              <w:pStyle w:val="Compact"/>
+            </w:pPr>
+            <w:r>
+              <w:t xml:space="preserve">2024</w:t>
+            </w:r>
+          </w:p>
+        </w:tc>
+        <w:tc>
+          <w:tcPr/>
+          <w:p>
+            <w:pPr>
+              <w:pStyle w:val="Compact"/>
+            </w:pPr>
+            <w:r>
               <w:t xml:space="preserve">HB1199</w:t>
             </w:r>
           </w:p>
@@ -2388,6 +3482,74 @@
               <w:pStyle w:val="Compact"/>
             </w:pPr>
             <w:r>
+              <w:t xml:space="preserve">HB1202</w:t>
+            </w:r>
+          </w:p>
+        </w:tc>
+        <w:tc>
+          <w:tcPr/>
+          <w:p>
+            <w:pPr>
+              <w:pStyle w:val="Compact"/>
+            </w:pPr>
+            <w:r>
+              <w:t xml:space="preserve">Required the state to issue residential driveway permits within 60 days.</w:t>
+            </w:r>
+          </w:p>
+        </w:tc>
+        <w:tc>
+          <w:tcPr/>
+          <w:p>
+            <w:pPr>
+              <w:pStyle w:val="Compact"/>
+            </w:pPr>
+            <w:r>
+              <w:t xml:space="preserve">Building more homes: zoning and land use</w:t>
+            </w:r>
+          </w:p>
+        </w:tc>
+        <w:tc>
+          <w:tcPr/>
+          <w:p>
+            <w:pPr>
+              <w:pStyle w:val="Compact"/>
+            </w:pPr>
+            <w:r>
+              <w:t xml:space="preserve">Became law</w:t>
+            </w:r>
+          </w:p>
+        </w:tc>
+        <w:tc>
+          <w:tcPr/>
+          <w:p>
+            <w:pPr>
+              <w:pStyle w:val="Compact"/>
+            </w:pPr>
+            <w:r>
+              <w:t xml:space="preserve">adjacent</w:t>
+            </w:r>
+          </w:p>
+        </w:tc>
+      </w:tr>
+      <w:tr>
+        <w:tc>
+          <w:tcPr/>
+          <w:p>
+            <w:pPr>
+              <w:pStyle w:val="Compact"/>
+            </w:pPr>
+            <w:r>
+              <w:t xml:space="preserve">2024</w:t>
+            </w:r>
+          </w:p>
+        </w:tc>
+        <w:tc>
+          <w:tcPr/>
+          <w:p>
+            <w:pPr>
+              <w:pStyle w:val="Compact"/>
+            </w:pPr>
+            <w:r>
               <w:t xml:space="preserve">HB1291</w:t>
             </w:r>
           </w:p>
@@ -2536,6 +3698,74 @@
               <w:pStyle w:val="Compact"/>
             </w:pPr>
             <w:r>
+              <w:t xml:space="preserve">HB1361</w:t>
+            </w:r>
+          </w:p>
+        </w:tc>
+        <w:tc>
+          <w:tcPr/>
+          <w:p>
+            <w:pPr>
+              <w:pStyle w:val="Compact"/>
+            </w:pPr>
+            <w:r>
+              <w:t xml:space="preserve">Required municipalities to provide realistic opportunities for manufactured housing and rewrote manufactured-home subdivision rules.</w:t>
+            </w:r>
+          </w:p>
+        </w:tc>
+        <w:tc>
+          <w:tcPr/>
+          <w:p>
+            <w:pPr>
+              <w:pStyle w:val="Compact"/>
+            </w:pPr>
+            <w:r>
+              <w:t xml:space="preserve">Manufactured, tiny, and factory-built homes</w:t>
+            </w:r>
+          </w:p>
+        </w:tc>
+        <w:tc>
+          <w:tcPr/>
+          <w:p>
+            <w:pPr>
+              <w:pStyle w:val="Compact"/>
+            </w:pPr>
+            <w:r>
+              <w:t xml:space="preserve">Became law</w:t>
+            </w:r>
+          </w:p>
+        </w:tc>
+        <w:tc>
+          <w:tcPr/>
+          <w:p>
+            <w:pPr>
+              <w:pStyle w:val="Compact"/>
+            </w:pPr>
+            <w:r>
+              <w:t xml:space="preserve">core</w:t>
+            </w:r>
+          </w:p>
+        </w:tc>
+      </w:tr>
+      <w:tr>
+        <w:tc>
+          <w:tcPr/>
+          <w:p>
+            <w:pPr>
+              <w:pStyle w:val="Compact"/>
+            </w:pPr>
+            <w:r>
+              <w:t xml:space="preserve">2024</w:t>
+            </w:r>
+          </w:p>
+        </w:tc>
+        <w:tc>
+          <w:tcPr/>
+          <w:p>
+            <w:pPr>
+              <w:pStyle w:val="Compact"/>
+            </w:pPr>
+            <w:r>
               <w:t xml:space="preserve">HB1396</w:t>
             </w:r>
           </w:p>
@@ -2604,6 +3834,142 @@
               <w:pStyle w:val="Compact"/>
             </w:pPr>
             <w:r>
+              <w:t xml:space="preserve">HB1399</w:t>
+            </w:r>
+          </w:p>
+        </w:tc>
+        <w:tc>
+          <w:tcPr/>
+          <w:p>
+            <w:pPr>
+              <w:pStyle w:val="Compact"/>
+            </w:pPr>
+            <w:r>
+              <w:t xml:space="preserve">Would have let municipalities permit two residential units in certain single-family zones.</w:t>
+            </w:r>
+          </w:p>
+        </w:tc>
+        <w:tc>
+          <w:tcPr/>
+          <w:p>
+            <w:pPr>
+              <w:pStyle w:val="Compact"/>
+            </w:pPr>
+            <w:r>
+              <w:t xml:space="preserve">Building more homes: zoning and land use</w:t>
+            </w:r>
+          </w:p>
+        </w:tc>
+        <w:tc>
+          <w:tcPr/>
+          <w:p>
+            <w:pPr>
+              <w:pStyle w:val="Compact"/>
+            </w:pPr>
+            <w:r>
+              <w:t xml:space="preserve">Interim study</w:t>
+            </w:r>
+          </w:p>
+        </w:tc>
+        <w:tc>
+          <w:tcPr/>
+          <w:p>
+            <w:pPr>
+              <w:pStyle w:val="Compact"/>
+            </w:pPr>
+            <w:r>
+              <w:t xml:space="preserve">core</w:t>
+            </w:r>
+          </w:p>
+        </w:tc>
+      </w:tr>
+      <w:tr>
+        <w:tc>
+          <w:tcPr/>
+          <w:p>
+            <w:pPr>
+              <w:pStyle w:val="Compact"/>
+            </w:pPr>
+            <w:r>
+              <w:t xml:space="preserve">2024</w:t>
+            </w:r>
+          </w:p>
+        </w:tc>
+        <w:tc>
+          <w:tcPr/>
+          <w:p>
+            <w:pPr>
+              <w:pStyle w:val="Compact"/>
+            </w:pPr>
+            <w:r>
+              <w:t xml:space="preserve">HB1400</w:t>
+            </w:r>
+          </w:p>
+        </w:tc>
+        <w:tc>
+          <w:tcPr/>
+          <w:p>
+            <w:pPr>
+              <w:pStyle w:val="Compact"/>
+            </w:pPr>
+            <w:r>
+              <w:t xml:space="preserve">Housing omnibus: tax incentives for office-to-housing conversions, limits on local parking mandates, alternative parking, and faster local zoning amendments.</w:t>
+            </w:r>
+          </w:p>
+        </w:tc>
+        <w:tc>
+          <w:tcPr/>
+          <w:p>
+            <w:pPr>
+              <w:pStyle w:val="Compact"/>
+            </w:pPr>
+            <w:r>
+              <w:t xml:space="preserve">Building more homes: zoning and land use</w:t>
+            </w:r>
+          </w:p>
+        </w:tc>
+        <w:tc>
+          <w:tcPr/>
+          <w:p>
+            <w:pPr>
+              <w:pStyle w:val="Compact"/>
+            </w:pPr>
+            <w:r>
+              <w:t xml:space="preserve">Became law</w:t>
+            </w:r>
+          </w:p>
+        </w:tc>
+        <w:tc>
+          <w:tcPr/>
+          <w:p>
+            <w:pPr>
+              <w:pStyle w:val="Compact"/>
+            </w:pPr>
+            <w:r>
+              <w:t xml:space="preserve">core</w:t>
+            </w:r>
+          </w:p>
+        </w:tc>
+      </w:tr>
+      <w:tr>
+        <w:tc>
+          <w:tcPr/>
+          <w:p>
+            <w:pPr>
+              <w:pStyle w:val="Compact"/>
+            </w:pPr>
+            <w:r>
+              <w:t xml:space="preserve">2024</w:t>
+            </w:r>
+          </w:p>
+        </w:tc>
+        <w:tc>
+          <w:tcPr/>
+          <w:p>
+            <w:pPr>
+              <w:pStyle w:val="Compact"/>
+            </w:pPr>
+            <w:r>
               <w:t xml:space="preserve">HB1470</w:t>
             </w:r>
           </w:p>
@@ -2740,6 +4106,74 @@
               <w:pStyle w:val="Compact"/>
             </w:pPr>
             <w:r>
+              <w:t xml:space="preserve">HB1567</w:t>
+            </w:r>
+          </w:p>
+        </w:tc>
+        <w:tc>
+          <w:tcPr/>
+          <w:p>
+            <w:pPr>
+              <w:pStyle w:val="Compact"/>
+            </w:pPr>
+            <w:r>
+              <w:t xml:space="preserve">Loosened municipal zoning rules for home-based child care.</w:t>
+            </w:r>
+          </w:p>
+        </w:tc>
+        <w:tc>
+          <w:tcPr/>
+          <w:p>
+            <w:pPr>
+              <w:pStyle w:val="Compact"/>
+            </w:pPr>
+            <w:r>
+              <w:t xml:space="preserve">Building more homes: zoning and land use</w:t>
+            </w:r>
+          </w:p>
+        </w:tc>
+        <w:tc>
+          <w:tcPr/>
+          <w:p>
+            <w:pPr>
+              <w:pStyle w:val="Compact"/>
+            </w:pPr>
+            <w:r>
+              <w:t xml:space="preserve">Became law</w:t>
+            </w:r>
+          </w:p>
+        </w:tc>
+        <w:tc>
+          <w:tcPr/>
+          <w:p>
+            <w:pPr>
+              <w:pStyle w:val="Compact"/>
+            </w:pPr>
+            <w:r>
+              <w:t xml:space="preserve">adjacent</w:t>
+            </w:r>
+          </w:p>
+        </w:tc>
+      </w:tr>
+      <w:tr>
+        <w:tc>
+          <w:tcPr/>
+          <w:p>
+            <w:pPr>
+              <w:pStyle w:val="Compact"/>
+            </w:pPr>
+            <w:r>
+              <w:t xml:space="preserve">2024</w:t>
+            </w:r>
+          </w:p>
+        </w:tc>
+        <w:tc>
+          <w:tcPr/>
+          <w:p>
+            <w:pPr>
+              <w:pStyle w:val="Compact"/>
+            </w:pPr>
+            <w:r>
               <w:t xml:space="preserve">SB318</w:t>
             </w:r>
           </w:p>
@@ -2785,6 +4219,142 @@
             </w:pPr>
             <w:r>
               <w:t xml:space="preserve">adjacent</w:t>
+            </w:r>
+          </w:p>
+        </w:tc>
+      </w:tr>
+      <w:tr>
+        <w:tc>
+          <w:tcPr/>
+          <w:p>
+            <w:pPr>
+              <w:pStyle w:val="Compact"/>
+            </w:pPr>
+            <w:r>
+              <w:t xml:space="preserve">2024</w:t>
+            </w:r>
+          </w:p>
+        </w:tc>
+        <w:tc>
+          <w:tcPr/>
+          <w:p>
+            <w:pPr>
+              <w:pStyle w:val="Compact"/>
+            </w:pPr>
+            <w:r>
+              <w:t xml:space="preserve">SB406</w:t>
+            </w:r>
+          </w:p>
+        </w:tc>
+        <w:tc>
+          <w:tcPr/>
+          <w:p>
+            <w:pPr>
+              <w:pStyle w:val="Compact"/>
+            </w:pPr>
+            <w:r>
+              <w:t xml:space="preserve">Appropriated $2.5 million to raise the rates paid to homeless shelter programs.</w:t>
+            </w:r>
+          </w:p>
+        </w:tc>
+        <w:tc>
+          <w:tcPr/>
+          <w:p>
+            <w:pPr>
+              <w:pStyle w:val="Compact"/>
+            </w:pPr>
+            <w:r>
+              <w:t xml:space="preserve">Homelessness and housing stability</w:t>
+            </w:r>
+          </w:p>
+        </w:tc>
+        <w:tc>
+          <w:tcPr/>
+          <w:p>
+            <w:pPr>
+              <w:pStyle w:val="Compact"/>
+            </w:pPr>
+            <w:r>
+              <w:t xml:space="preserve">Became law</w:t>
+            </w:r>
+          </w:p>
+        </w:tc>
+        <w:tc>
+          <w:tcPr/>
+          <w:p>
+            <w:pPr>
+              <w:pStyle w:val="Compact"/>
+            </w:pPr>
+            <w:r>
+              <w:t xml:space="preserve">core</w:t>
+            </w:r>
+          </w:p>
+        </w:tc>
+      </w:tr>
+      <w:tr>
+        <w:tc>
+          <w:tcPr/>
+          <w:p>
+            <w:pPr>
+              <w:pStyle w:val="Compact"/>
+            </w:pPr>
+            <w:r>
+              <w:t xml:space="preserve">2024</w:t>
+            </w:r>
+          </w:p>
+        </w:tc>
+        <w:tc>
+          <w:tcPr/>
+          <w:p>
+            <w:pPr>
+              <w:pStyle w:val="Compact"/>
+            </w:pPr>
+            <w:r>
+              <w:t xml:space="preserve">SB454</w:t>
+            </w:r>
+          </w:p>
+        </w:tc>
+        <w:tc>
+          <w:tcPr/>
+          <w:p>
+            <w:pPr>
+              <w:pStyle w:val="Compact"/>
+            </w:pPr>
+            <w:r>
+              <w:t xml:space="preserve">Would have doubled the real estate transfer tax revenue flowing to the Affordable Housing Fund.</w:t>
+            </w:r>
+          </w:p>
+        </w:tc>
+        <w:tc>
+          <w:tcPr/>
+          <w:p>
+            <w:pPr>
+              <w:pStyle w:val="Compact"/>
+            </w:pPr>
+            <w:r>
+              <w:t xml:space="preserve">State housing money and programs</w:t>
+            </w:r>
+          </w:p>
+        </w:tc>
+        <w:tc>
+          <w:tcPr/>
+          <w:p>
+            <w:pPr>
+              <w:pStyle w:val="Compact"/>
+            </w:pPr>
+            <w:r>
+              <w:t xml:space="preserve">Did not pass</w:t>
+            </w:r>
+          </w:p>
+        </w:tc>
+        <w:tc>
+          <w:tcPr/>
+          <w:p>
+            <w:pPr>
+              <w:pStyle w:val="Compact"/>
+            </w:pPr>
+            <w:r>
+              <w:t xml:space="preserve">core</w:t>
             </w:r>
           </w:p>
         </w:tc>
@@ -10682,7 +12252,7 @@
           <w:i/>
           <w:iCs/>
         </w:rPr>
-        <w:t xml:space="preserve">24 bills · 7 became law · basket:</w:t>
+        <w:t xml:space="preserve">35 bills · 16 became law · basket:</w:t>
       </w:r>
       <w:r>
         <w:rPr>
@@ -10720,7 +12290,7 @@
         <w:pStyle w:val="BodyText"/>
       </w:pPr>
       <w:r>
-        <w:t xml:space="preserve">Every enactment is from 2025-2026: homes in commercial zones (HB631 2025, HB1010 2026, HB1588 2026), limits on local dwelling-unit restrictions (HB457 2025), plus the 2021 planning omnibus SB86. The repeal attempts against these new laws (HB1011, HB1012, HB1016 in 2026) all died.</w:t>
+        <w:t xml:space="preserve">Supply-side zoning began passing in 2024, not 2025: HB1400 (2024) packaged office-to-housing tax incentives, parking-mandate limits, and faster local zoning amendments (conference report 205-149); HB631 (2025) and HB1010/HB1588 (2026) opened commercial land to homes; HB457 (2025) limited local dwelling-unit restrictions; the 2021 planning omnibus SB86 and the 2022 land-use omnibus HB1661 came earlier. Statewide density mandates still fail: 4-units-by-right (HB44 2023) was crushed 117-232, the duplex-enabling HB1399 (2024) passed the House 220-140 and went to Senate interim study, and the 2026 repeal attempts against the new laws all died.</w:t>
       </w:r>
     </w:p>
     <w:p>
@@ -10728,7 +12298,7 @@
         <w:pStyle w:val="BodyText"/>
       </w:pPr>
       <w:r>
-        <w:t xml:space="preserve">Examples: 2025 HB631, 2026 HB1010, 2026 HB1588, 2024 SB538, 2026 SB90</w:t>
+        <w:t xml:space="preserve">Examples: 2024 HB1400, 2025 HB631, 2026 HB1588, 2023 HB44, 2024 HB1399, 2026 SB90</w:t>
       </w:r>
     </w:p>
     <w:bookmarkEnd w:id="11"/>
@@ -10818,7 +12388,7 @@
           <w:i/>
           <w:iCs/>
         </w:rPr>
-        <w:t xml:space="preserve">36 bills · 9 became law · basket:</w:t>
+        <w:t xml:space="preserve">39 bills · 11 became law · basket:</w:t>
       </w:r>
       <w:r>
         <w:rPr>
@@ -10856,7 +12426,7 @@
         <w:pStyle w:val="BodyText"/>
       </w:pPr>
       <w:r>
-        <w:t xml:space="preserve">Standalone money bills usually die - often after unanimous Senate votes - while the same dollars move through HB2, the budget trailer: Affordable Housing Fund ($25M in 2021 and again in 2023), InvestNH, Housing Champion ($5M), Partners in Housing. New taxes for housing (HB1786, HB1707) and transfer-tax increases (HB530, SB81) never reached a floor win.</w:t>
+        <w:t xml:space="preserve">Standalone money bills usually die - often after unanimous Senate votes - while the same dollars move through HB2, the budget trailer: Affordable Housing Fund ($25M in 2021 and 2023), InvestNH ($10M), Housing Champion ($5M), Partners in Housing. SB454 (2024), doubling the transfer-tax stream to the fund, passed the Senate unanimously and was tabled by the House 180-176 (division vote); SB152 (2021) and SB231 (2023) saw their dollars ride HB2 instead. New taxes for housing (HB1786, HB1707) never reached a floor win.</w:t>
       </w:r>
     </w:p>
     <w:p>
@@ -10864,7 +12434,7 @@
         <w:pStyle w:val="BodyText"/>
       </w:pPr>
       <w:r>
-        <w:t xml:space="preserve">Examples: 2021 SB152, 2023 SB145, 2026 HB572, 2026 HB1786, 2026 HB1042</w:t>
+        <w:t xml:space="preserve">Examples: 2021 SB152, 2024 SB454, 2023 SB231, 2023 SB145, 2026 HB1786</w:t>
       </w:r>
     </w:p>
     <w:bookmarkEnd w:id="13"/>
@@ -11022,7 +12592,7 @@
           <w:i/>
           <w:iCs/>
         </w:rPr>
-        <w:t xml:space="preserve">9 bills · 2 became law · basket:</w:t>
+        <w:t xml:space="preserve">13 bills · 6 became law · basket:</w:t>
       </w:r>
       <w:r>
         <w:rPr>
@@ -11060,7 +12630,7 @@
         <w:pStyle w:val="BodyText"/>
       </w:pPr>
       <w:r>
-        <w:t xml:space="preserve">Standalone shelter-funding bills died at Senate deadlines or on tables (SB415 2022, SB113/SB114 2025, HB519); the big shelter dollars moved through HB2 ($10M in 2023; $10M opioid-fund shelter money in 2025). The Council on Housing Stability was codified (HB503, enacted 2022) and updated (SB179 2025).</w:t>
+        <w:t xml:space="preserve">Shelter funding passed standalone exactly once: SB406 (2024) put $2.5M into shelter program rates. The other attempts died - SB415 (2022) tabled 13-11, SB113/SB114 (2025) at the Senate’s own deadline, HB519 in the House - while the bigger dollars moved through HB2 ($10M in 2023; $5M/year opioid-fund shelter money in 2025). The Council on Housing Stability was codified (HB503, enacted 2022) and updated (SB179 2025); study committees and recovery-house rules (HB286/HB377 2021, SB223 2022) also passed.</w:t>
       </w:r>
     </w:p>
     <w:p>
@@ -11068,7 +12638,7 @@
         <w:pStyle w:val="BodyText"/>
       </w:pPr>
       <w:r>
-        <w:t xml:space="preserve">Examples: 2022 SB415, 2025 SB113, 2021 HB503, 2025 SB179</w:t>
+        <w:t xml:space="preserve">Examples: 2024 SB406, 2022 SB415, 2025 SB113, 2021 HB503, 2025 SB179</w:t>
       </w:r>
     </w:p>
     <w:bookmarkEnd w:id="16"/>
@@ -11090,7 +12660,7 @@
           <w:i/>
           <w:iCs/>
         </w:rPr>
-        <w:t xml:space="preserve">9 bills · 2 became law · basket:</w:t>
+        <w:t xml:space="preserve">10 bills · 3 became law · basket:</w:t>
       </w:r>
       <w:r>
         <w:rPr>
@@ -11128,7 +12698,7 @@
         <w:pStyle w:val="BodyText"/>
       </w:pPr>
       <w:r>
-        <w:t xml:space="preserve">Resident protections advanced narrowly (SB166 2025 sale notice) and tiny houses/yurts were legalized as innovative housing (HB1681 2026). But the dispute-resolution Board of Manufactured Housing was repealed by HB2 2023 while the bill to fix it (SB203) died between the chambers, and by-right manufactured housing (HB685 2025) died in conference.</w:t>
+        <w:t xml:space="preserve">Two supply-side wins are law: HB1361 (2024) requires municipalities to provide realistic opportunities for manufactured housing, and HB1681 (2026) legalized tiny houses and yurts. Resident protections advanced narrowly (SB166 2025 sale notice). The structural losses stand: HB2 2023 (79:301) repealed the Board of Manufactured Housing while SB203 died between the chambers; SB318 (2024) was vetoed; by-right manufactured housing in all residential zones (HB685 2025) died in conference.</w:t>
       </w:r>
     </w:p>
     <w:p>
@@ -11136,7 +12706,7 @@
         <w:pStyle w:val="BodyText"/>
       </w:pPr>
       <w:r>
-        <w:t xml:space="preserve">Examples: 2025 SB166, 2026 HB1681, 2023 SB203, 2025 HB685</w:t>
+        <w:t xml:space="preserve">Examples: 2024 HB1361, 2026 HB1681, 2025 SB166, 2023 SB203, 2025 HB685</w:t>
       </w:r>
     </w:p>
     <w:bookmarkEnd w:id="17"/>
@@ -11158,7 +12728,7 @@
           <w:i/>
           <w:iCs/>
         </w:rPr>
-        <w:t xml:space="preserve">11 bills · 2 became law · basket:</w:t>
+        <w:t xml:space="preserve">14 bills · 3 became law · basket:</w:t>
       </w:r>
       <w:r>
         <w:rPr>
@@ -11196,7 +12766,7 @@
         <w:pStyle w:val="BodyText"/>
       </w:pPr>
       <w:r>
-        <w:t xml:space="preserve">Conflict-of-interest recusal (HB92 2025) and abutter-appeal rules (HB1359 2024) became law; board training died repeatedly (2020 HB1629, 2021 HB586, 2022 SB400, 2026 HB1802). The Housing Appeals Board was restructured through HB2 2025, not a standalone bill.</w:t>
+        <w:t xml:space="preserve">Conflict-of-interest recusal (HB92 2025), abutter-appeal rules (HB1359 2024), and a planning-board deadline extension (HB332 2021) became law; board training died repeatedly (2020 HB1629, 2021 HB586, 2022 SB400, 2026 HB1802). The Housing Appeals Board survived two 2020 repeal/replace attempts (SB721, SB735, both killed in the Senate) and was then restructured through HB2 2025, not a standalone bill.</w:t>
       </w:r>
     </w:p>
     <w:p>
@@ -11204,7 +12774,7 @@
         <w:pStyle w:val="BodyText"/>
       </w:pPr>
       <w:r>
-        <w:t xml:space="preserve">Examples: 2025 HB92, 2024 HB1359, 2020 HB1629, 2026 HB1802</w:t>
+        <w:t xml:space="preserve">Examples: 2025 HB92, 2024 HB1359, 2020 SB735, 2020 HB1629, 2026 HB1802</w:t>
       </w:r>
     </w:p>
     <w:bookmarkEnd w:id="18"/>
@@ -11226,7 +12796,7 @@
           <w:i/>
           <w:iCs/>
         </w:rPr>
-        <w:t xml:space="preserve">6 bills · 2 became law · basket:</w:t>
+        <w:t xml:space="preserve">7 bills · 3 became law · basket:</w:t>
       </w:r>
       <w:r>
         <w:rPr>
@@ -12656,6 +14226,107 @@
               <w:pStyle w:val="Compact"/>
             </w:pPr>
             <w:r>
+              <w:t xml:space="preserve">SB102</w:t>
+            </w:r>
+          </w:p>
+        </w:tc>
+        <w:tc>
+          <w:tcPr/>
+          <w:p>
+            <w:pPr>
+              <w:pStyle w:val="Compact"/>
+            </w:pPr>
+            <w:r>
+              <w:t xml:space="preserve">House</w:t>
+            </w:r>
+          </w:p>
+        </w:tc>
+        <w:tc>
+          <w:tcPr/>
+          <w:p>
+            <w:pPr>
+              <w:pStyle w:val="Compact"/>
+            </w:pPr>
+            <w:r>
+              <w:t xml:space="preserve">2021-06-04</w:t>
+            </w:r>
+          </w:p>
+        </w:tc>
+        <w:tc>
+          <w:tcPr/>
+          <w:p>
+            <w:pPr>
+              <w:pStyle w:val="Compact"/>
+            </w:pPr>
+            <w:r>
+              <w:t xml:space="preserve">OTP</w:t>
+            </w:r>
+          </w:p>
+        </w:tc>
+        <w:tc>
+          <w:tcPr/>
+          <w:p>
+            <w:pPr>
+              <w:pStyle w:val="Compact"/>
+            </w:pPr>
+            <w:r>
+              <w:t xml:space="preserve">208</w:t>
+            </w:r>
+          </w:p>
+        </w:tc>
+        <w:tc>
+          <w:tcPr/>
+          <w:p>
+            <w:pPr>
+              <w:pStyle w:val="Compact"/>
+            </w:pPr>
+            <w:r>
+              <w:t xml:space="preserve">165</w:t>
+            </w:r>
+          </w:p>
+        </w:tc>
+        <w:tc>
+          <w:tcPr/>
+          <w:p>
+            <w:pPr>
+              <w:pStyle w:val="Compact"/>
+            </w:pPr>
+            <w:r>
+              <w:t xml:space="preserve">55.8</w:t>
+            </w:r>
+          </w:p>
+        </w:tc>
+        <w:tc>
+          <w:tcPr/>
+          <w:p>
+            <w:pPr>
+              <w:pStyle w:val="Compact"/>
+            </w:pPr>
+            <w:r>
+              <w:t xml:space="preserve">R 33–161, D 171–1, I 3–1</w:t>
+            </w:r>
+          </w:p>
+        </w:tc>
+      </w:tr>
+      <w:tr>
+        <w:tc>
+          <w:tcPr/>
+          <w:p>
+            <w:pPr>
+              <w:pStyle w:val="Compact"/>
+            </w:pPr>
+            <w:r>
+              <w:t xml:space="preserve">2021</w:t>
+            </w:r>
+          </w:p>
+        </w:tc>
+        <w:tc>
+          <w:tcPr/>
+          <w:p>
+            <w:pPr>
+              <w:pStyle w:val="Compact"/>
+            </w:pPr>
+            <w:r>
               <w:t xml:space="preserve">SB126</w:t>
             </w:r>
           </w:p>
@@ -13966,6 +15637,309 @@
               <w:pStyle w:val="Compact"/>
             </w:pPr>
             <w:r>
+              <w:t xml:space="preserve">HB1661</w:t>
+            </w:r>
+          </w:p>
+        </w:tc>
+        <w:tc>
+          <w:tcPr/>
+          <w:p>
+            <w:pPr>
+              <w:pStyle w:val="Compact"/>
+            </w:pPr>
+            <w:r>
+              <w:t xml:space="preserve">House</w:t>
+            </w:r>
+          </w:p>
+        </w:tc>
+        <w:tc>
+          <w:tcPr/>
+          <w:p>
+            <w:pPr>
+              <w:pStyle w:val="Compact"/>
+            </w:pPr>
+            <w:r>
+              <w:t xml:space="preserve">2022-03-31</w:t>
+            </w:r>
+          </w:p>
+        </w:tc>
+        <w:tc>
+          <w:tcPr/>
+          <w:p>
+            <w:pPr>
+              <w:pStyle w:val="Compact"/>
+            </w:pPr>
+            <w:r>
+              <w:t xml:space="preserve">Adopt Amendment</w:t>
+            </w:r>
+          </w:p>
+        </w:tc>
+        <w:tc>
+          <w:tcPr/>
+          <w:p>
+            <w:pPr>
+              <w:pStyle w:val="Compact"/>
+            </w:pPr>
+            <w:r>
+              <w:t xml:space="preserve">271</w:t>
+            </w:r>
+          </w:p>
+        </w:tc>
+        <w:tc>
+          <w:tcPr/>
+          <w:p>
+            <w:pPr>
+              <w:pStyle w:val="Compact"/>
+            </w:pPr>
+            <w:r>
+              <w:t xml:space="preserve">65</w:t>
+            </w:r>
+          </w:p>
+        </w:tc>
+        <w:tc>
+          <w:tcPr/>
+          <w:p>
+            <w:pPr>
+              <w:pStyle w:val="Compact"/>
+            </w:pPr>
+            <w:r>
+              <w:t xml:space="preserve">80.7</w:t>
+            </w:r>
+          </w:p>
+        </w:tc>
+        <w:tc>
+          <w:tcPr/>
+          <w:p>
+            <w:pPr>
+              <w:pStyle w:val="Compact"/>
+            </w:pPr>
+            <w:r>
+              <w:t xml:space="preserve">R 121–58, D 148–4, I 1–1</w:t>
+            </w:r>
+          </w:p>
+        </w:tc>
+      </w:tr>
+      <w:tr>
+        <w:tc>
+          <w:tcPr/>
+          <w:p>
+            <w:pPr>
+              <w:pStyle w:val="Compact"/>
+            </w:pPr>
+            <w:r>
+              <w:t xml:space="preserve">2022</w:t>
+            </w:r>
+          </w:p>
+        </w:tc>
+        <w:tc>
+          <w:tcPr/>
+          <w:p>
+            <w:pPr>
+              <w:pStyle w:val="Compact"/>
+            </w:pPr>
+            <w:r>
+              <w:t xml:space="preserve">HB1661</w:t>
+            </w:r>
+          </w:p>
+        </w:tc>
+        <w:tc>
+          <w:tcPr/>
+          <w:p>
+            <w:pPr>
+              <w:pStyle w:val="Compact"/>
+            </w:pPr>
+            <w:r>
+              <w:t xml:space="preserve">Senate</w:t>
+            </w:r>
+          </w:p>
+        </w:tc>
+        <w:tc>
+          <w:tcPr/>
+          <w:p>
+            <w:pPr>
+              <w:pStyle w:val="Compact"/>
+            </w:pPr>
+            <w:r>
+              <w:t xml:space="preserve">2022-05-05</w:t>
+            </w:r>
+          </w:p>
+        </w:tc>
+        <w:tc>
+          <w:tcPr/>
+          <w:p>
+            <w:pPr>
+              <w:pStyle w:val="Compact"/>
+            </w:pPr>
+            <w:r>
+              <w:t xml:space="preserve">Ought to Pass w/Amendment</w:t>
+            </w:r>
+          </w:p>
+        </w:tc>
+        <w:tc>
+          <w:tcPr/>
+          <w:p>
+            <w:pPr>
+              <w:pStyle w:val="Compact"/>
+            </w:pPr>
+            <w:r>
+              <w:t xml:space="preserve">23</w:t>
+            </w:r>
+          </w:p>
+        </w:tc>
+        <w:tc>
+          <w:tcPr/>
+          <w:p>
+            <w:pPr>
+              <w:pStyle w:val="Compact"/>
+            </w:pPr>
+            <w:r>
+              <w:t xml:space="preserve">0</w:t>
+            </w:r>
+          </w:p>
+        </w:tc>
+        <w:tc>
+          <w:tcPr/>
+          <w:p>
+            <w:pPr>
+              <w:pStyle w:val="Compact"/>
+            </w:pPr>
+            <w:r>
+              <w:t xml:space="preserve">100.0</w:t>
+            </w:r>
+          </w:p>
+        </w:tc>
+        <w:tc>
+          <w:tcPr/>
+          <w:p>
+            <w:pPr>
+              <w:pStyle w:val="Compact"/>
+            </w:pPr>
+            <w:r>
+              <w:t xml:space="preserve">R 13–0, D 10–0</w:t>
+            </w:r>
+          </w:p>
+        </w:tc>
+      </w:tr>
+      <w:tr>
+        <w:tc>
+          <w:tcPr/>
+          <w:p>
+            <w:pPr>
+              <w:pStyle w:val="Compact"/>
+            </w:pPr>
+            <w:r>
+              <w:t xml:space="preserve">2022</w:t>
+            </w:r>
+          </w:p>
+        </w:tc>
+        <w:tc>
+          <w:tcPr/>
+          <w:p>
+            <w:pPr>
+              <w:pStyle w:val="Compact"/>
+            </w:pPr>
+            <w:r>
+              <w:t xml:space="preserve">HB1661</w:t>
+            </w:r>
+          </w:p>
+        </w:tc>
+        <w:tc>
+          <w:tcPr/>
+          <w:p>
+            <w:pPr>
+              <w:pStyle w:val="Compact"/>
+            </w:pPr>
+            <w:r>
+              <w:t xml:space="preserve">House</w:t>
+            </w:r>
+          </w:p>
+        </w:tc>
+        <w:tc>
+          <w:tcPr/>
+          <w:p>
+            <w:pPr>
+              <w:pStyle w:val="Compact"/>
+            </w:pPr>
+            <w:r>
+              <w:t xml:space="preserve">2022-05-26</w:t>
+            </w:r>
+          </w:p>
+        </w:tc>
+        <w:tc>
+          <w:tcPr/>
+          <w:p>
+            <w:pPr>
+              <w:pStyle w:val="Compact"/>
+            </w:pPr>
+            <w:r>
+              <w:t xml:space="preserve">Adopt CofC Report</w:t>
+            </w:r>
+          </w:p>
+        </w:tc>
+        <w:tc>
+          <w:tcPr/>
+          <w:p>
+            <w:pPr>
+              <w:pStyle w:val="Compact"/>
+            </w:pPr>
+            <w:r>
+              <w:t xml:space="preserve">244</w:t>
+            </w:r>
+          </w:p>
+        </w:tc>
+        <w:tc>
+          <w:tcPr/>
+          <w:p>
+            <w:pPr>
+              <w:pStyle w:val="Compact"/>
+            </w:pPr>
+            <w:r>
+              <w:t xml:space="preserve">99</w:t>
+            </w:r>
+          </w:p>
+        </w:tc>
+        <w:tc>
+          <w:tcPr/>
+          <w:p>
+            <w:pPr>
+              <w:pStyle w:val="Compact"/>
+            </w:pPr>
+            <w:r>
+              <w:t xml:space="preserve">71.1</w:t>
+            </w:r>
+          </w:p>
+        </w:tc>
+        <w:tc>
+          <w:tcPr/>
+          <w:p>
+            <w:pPr>
+              <w:pStyle w:val="Compact"/>
+            </w:pPr>
+            <w:r>
+              <w:t xml:space="preserve">R 82–95, D 158–0, I 2–2</w:t>
+            </w:r>
+          </w:p>
+        </w:tc>
+      </w:tr>
+      <w:tr>
+        <w:tc>
+          <w:tcPr/>
+          <w:p>
+            <w:pPr>
+              <w:pStyle w:val="Compact"/>
+            </w:pPr>
+            <w:r>
+              <w:t xml:space="preserve">2022</w:t>
+            </w:r>
+          </w:p>
+        </w:tc>
+        <w:tc>
+          <w:tcPr/>
+          <w:p>
+            <w:pPr>
+              <w:pStyle w:val="Compact"/>
+            </w:pPr>
+            <w:r>
               <w:t xml:space="preserve">HB1662</w:t>
             </w:r>
           </w:p>
@@ -14673,6 +16647,107 @@
               <w:pStyle w:val="Compact"/>
             </w:pPr>
             <w:r>
+              <w:t xml:space="preserve">HB44</w:t>
+            </w:r>
+          </w:p>
+        </w:tc>
+        <w:tc>
+          <w:tcPr/>
+          <w:p>
+            <w:pPr>
+              <w:pStyle w:val="Compact"/>
+            </w:pPr>
+            <w:r>
+              <w:t xml:space="preserve">House</w:t>
+            </w:r>
+          </w:p>
+        </w:tc>
+        <w:tc>
+          <w:tcPr/>
+          <w:p>
+            <w:pPr>
+              <w:pStyle w:val="Compact"/>
+            </w:pPr>
+            <w:r>
+              <w:t xml:space="preserve">2023-02-23</w:t>
+            </w:r>
+          </w:p>
+        </w:tc>
+        <w:tc>
+          <w:tcPr/>
+          <w:p>
+            <w:pPr>
+              <w:pStyle w:val="Compact"/>
+            </w:pPr>
+            <w:r>
+              <w:t xml:space="preserve">OTPA</w:t>
+            </w:r>
+          </w:p>
+        </w:tc>
+        <w:tc>
+          <w:tcPr/>
+          <w:p>
+            <w:pPr>
+              <w:pStyle w:val="Compact"/>
+            </w:pPr>
+            <w:r>
+              <w:t xml:space="preserve">117</w:t>
+            </w:r>
+          </w:p>
+        </w:tc>
+        <w:tc>
+          <w:tcPr/>
+          <w:p>
+            <w:pPr>
+              <w:pStyle w:val="Compact"/>
+            </w:pPr>
+            <w:r>
+              <w:t xml:space="preserve">232</w:t>
+            </w:r>
+          </w:p>
+        </w:tc>
+        <w:tc>
+          <w:tcPr/>
+          <w:p>
+            <w:pPr>
+              <w:pStyle w:val="Compact"/>
+            </w:pPr>
+            <w:r>
+              <w:t xml:space="preserve">33.5</w:t>
+            </w:r>
+          </w:p>
+        </w:tc>
+        <w:tc>
+          <w:tcPr/>
+          <w:p>
+            <w:pPr>
+              <w:pStyle w:val="Compact"/>
+            </w:pPr>
+            <w:r>
+              <w:t xml:space="preserve">R 20–153, D 96–75, I 1–1</w:t>
+            </w:r>
+          </w:p>
+        </w:tc>
+      </w:tr>
+      <w:tr>
+        <w:tc>
+          <w:tcPr/>
+          <w:p>
+            <w:pPr>
+              <w:pStyle w:val="Compact"/>
+            </w:pPr>
+            <w:r>
+              <w:t xml:space="preserve">2023</w:t>
+            </w:r>
+          </w:p>
+        </w:tc>
+        <w:tc>
+          <w:tcPr/>
+          <w:p>
+            <w:pPr>
+              <w:pStyle w:val="Compact"/>
+            </w:pPr>
+            <w:r>
               <w:t xml:space="preserve">HB469</w:t>
             </w:r>
           </w:p>
@@ -16165,6 +18240,208 @@
             </w:pPr>
             <w:r>
               <w:t xml:space="preserve">R 14–177, D 179–3, I 0–1</w:t>
+            </w:r>
+          </w:p>
+        </w:tc>
+      </w:tr>
+      <w:tr>
+        <w:tc>
+          <w:tcPr/>
+          <w:p>
+            <w:pPr>
+              <w:pStyle w:val="Compact"/>
+            </w:pPr>
+            <w:r>
+              <w:t xml:space="preserve">2024</w:t>
+            </w:r>
+          </w:p>
+        </w:tc>
+        <w:tc>
+          <w:tcPr/>
+          <w:p>
+            <w:pPr>
+              <w:pStyle w:val="Compact"/>
+            </w:pPr>
+            <w:r>
+              <w:t xml:space="preserve">HB1399</w:t>
+            </w:r>
+          </w:p>
+        </w:tc>
+        <w:tc>
+          <w:tcPr/>
+          <w:p>
+            <w:pPr>
+              <w:pStyle w:val="Compact"/>
+            </w:pPr>
+            <w:r>
+              <w:t xml:space="preserve">House</w:t>
+            </w:r>
+          </w:p>
+        </w:tc>
+        <w:tc>
+          <w:tcPr/>
+          <w:p>
+            <w:pPr>
+              <w:pStyle w:val="Compact"/>
+            </w:pPr>
+            <w:r>
+              <w:t xml:space="preserve">2024-03-28</w:t>
+            </w:r>
+          </w:p>
+        </w:tc>
+        <w:tc>
+          <w:tcPr/>
+          <w:p>
+            <w:pPr>
+              <w:pStyle w:val="Compact"/>
+            </w:pPr>
+            <w:r>
+              <w:t xml:space="preserve">OTPA</w:t>
+            </w:r>
+          </w:p>
+        </w:tc>
+        <w:tc>
+          <w:tcPr/>
+          <w:p>
+            <w:pPr>
+              <w:pStyle w:val="Compact"/>
+            </w:pPr>
+            <w:r>
+              <w:t xml:space="preserve">220</w:t>
+            </w:r>
+          </w:p>
+        </w:tc>
+        <w:tc>
+          <w:tcPr/>
+          <w:p>
+            <w:pPr>
+              <w:pStyle w:val="Compact"/>
+            </w:pPr>
+            <w:r>
+              <w:t xml:space="preserve">140</w:t>
+            </w:r>
+          </w:p>
+        </w:tc>
+        <w:tc>
+          <w:tcPr/>
+          <w:p>
+            <w:pPr>
+              <w:pStyle w:val="Compact"/>
+            </w:pPr>
+            <w:r>
+              <w:t xml:space="preserve">61.1</w:t>
+            </w:r>
+          </w:p>
+        </w:tc>
+        <w:tc>
+          <w:tcPr/>
+          <w:p>
+            <w:pPr>
+              <w:pStyle w:val="Compact"/>
+            </w:pPr>
+            <w:r>
+              <w:t xml:space="preserve">R 66–109, D 152–29, I 1–1</w:t>
+            </w:r>
+          </w:p>
+        </w:tc>
+      </w:tr>
+      <w:tr>
+        <w:tc>
+          <w:tcPr/>
+          <w:p>
+            <w:pPr>
+              <w:pStyle w:val="Compact"/>
+            </w:pPr>
+            <w:r>
+              <w:t xml:space="preserve">2024</w:t>
+            </w:r>
+          </w:p>
+        </w:tc>
+        <w:tc>
+          <w:tcPr/>
+          <w:p>
+            <w:pPr>
+              <w:pStyle w:val="Compact"/>
+            </w:pPr>
+            <w:r>
+              <w:t xml:space="preserve">HB1400</w:t>
+            </w:r>
+          </w:p>
+        </w:tc>
+        <w:tc>
+          <w:tcPr/>
+          <w:p>
+            <w:pPr>
+              <w:pStyle w:val="Compact"/>
+            </w:pPr>
+            <w:r>
+              <w:t xml:space="preserve">House</w:t>
+            </w:r>
+          </w:p>
+        </w:tc>
+        <w:tc>
+          <w:tcPr/>
+          <w:p>
+            <w:pPr>
+              <w:pStyle w:val="Compact"/>
+            </w:pPr>
+            <w:r>
+              <w:t xml:space="preserve">2024-06-13</w:t>
+            </w:r>
+          </w:p>
+        </w:tc>
+        <w:tc>
+          <w:tcPr/>
+          <w:p>
+            <w:pPr>
+              <w:pStyle w:val="Compact"/>
+            </w:pPr>
+            <w:r>
+              <w:t xml:space="preserve">Adopt CofC Report</w:t>
+            </w:r>
+          </w:p>
+        </w:tc>
+        <w:tc>
+          <w:tcPr/>
+          <w:p>
+            <w:pPr>
+              <w:pStyle w:val="Compact"/>
+            </w:pPr>
+            <w:r>
+              <w:t xml:space="preserve">205</w:t>
+            </w:r>
+          </w:p>
+        </w:tc>
+        <w:tc>
+          <w:tcPr/>
+          <w:p>
+            <w:pPr>
+              <w:pStyle w:val="Compact"/>
+            </w:pPr>
+            <w:r>
+              <w:t xml:space="preserve">149</w:t>
+            </w:r>
+          </w:p>
+        </w:tc>
+        <w:tc>
+          <w:tcPr/>
+          <w:p>
+            <w:pPr>
+              <w:pStyle w:val="Compact"/>
+            </w:pPr>
+            <w:r>
+              <w:t xml:space="preserve">57.9</w:t>
+            </w:r>
+          </w:p>
+        </w:tc>
+        <w:tc>
+          <w:tcPr/>
+          <w:p>
+            <w:pPr>
+              <w:pStyle w:val="Compact"/>
+            </w:pPr>
+            <w:r>
+              <w:t xml:space="preserve">R 55–118, D 148–28, I 0–2</w:t>
             </w:r>
           </w:p>
         </w:tc>
@@ -19092,6 +21369,52 @@
             </w:pPr>
             <w:r>
               <w:t xml:space="preserve">Passed the House (SQL roll call: OTPA 220-143, 2024-03-28). In the Senate on 2024-05-22 a floor amendment failed by roll call 8-16 (matches the SQL roll call) a</w:t>
+            </w:r>
+          </w:p>
+        </w:tc>
+      </w:tr>
+      <w:tr>
+        <w:tc>
+          <w:tcPr/>
+          <w:p>
+            <w:pPr>
+              <w:pStyle w:val="Compact"/>
+            </w:pPr>
+            <w:r>
+              <w:t xml:space="preserve">2024 HB1399</w:t>
+            </w:r>
+          </w:p>
+        </w:tc>
+        <w:tc>
+          <w:tcPr/>
+          <w:p>
+            <w:pPr>
+              <w:pStyle w:val="Compact"/>
+            </w:pPr>
+            <w:r>
+              <w:t xml:space="preserve">Would have let municipalities permit two residential units in certain single-family zones.</w:t>
+            </w:r>
+          </w:p>
+        </w:tc>
+        <w:tc>
+          <w:tcPr/>
+          <w:p>
+            <w:pPr>
+              <w:pStyle w:val="Compact"/>
+            </w:pPr>
+            <w:r>
+              <w:t xml:space="preserve">House 220-140 (OTPA)</w:t>
+            </w:r>
+          </w:p>
+        </w:tc>
+        <w:tc>
+          <w:tcPr/>
+          <w:p>
+            <w:pPr>
+              <w:pStyle w:val="Compact"/>
+            </w:pPr>
+            <w:r>
+              <w:t xml:space="preserve">sent to interim study by the Senate</w:t>
             </w:r>
           </w:p>
         </w:tc>
@@ -19894,29 +22217,29 @@
               <w:pStyle w:val="Compact"/>
             </w:pPr>
             <w:r>
-              <w:t xml:space="preserve">HB1160</w:t>
-            </w:r>
-          </w:p>
-        </w:tc>
-        <w:tc>
-          <w:tcPr/>
-          <w:p>
-            <w:pPr>
-              <w:pStyle w:val="Compact"/>
-            </w:pPr>
-            <w:r>
-              <w:t xml:space="preserve">Edgar</w:t>
-            </w:r>
-          </w:p>
-        </w:tc>
-        <w:tc>
-          <w:tcPr/>
-          <w:p>
-            <w:pPr>
-              <w:pStyle w:val="Compact"/>
-            </w:pPr>
-            <w:r>
-              <w:t xml:space="preserve">Edgar (?), Loughman (?), Cushing (?), Maggiore (?), Cleaver (?), Bushway (?), Almy (?), Somssich (?), +5 more</w:t>
+              <w:t xml:space="preserve">SB721</w:t>
+            </w:r>
+          </w:p>
+        </w:tc>
+        <w:tc>
+          <w:tcPr/>
+          <w:p>
+            <w:pPr>
+              <w:pStyle w:val="Compact"/>
+            </w:pPr>
+            <w:r>
+              <w:t xml:space="preserve">Dietsch</w:t>
+            </w:r>
+          </w:p>
+        </w:tc>
+        <w:tc>
+          <w:tcPr/>
+          <w:p>
+            <w:pPr>
+              <w:pStyle w:val="Compact"/>
+            </w:pPr>
+            <w:r>
+              <w:t xml:space="preserve">Dietsch (?), Fuller Clark (?), Mullen (?), Maggiore (?)</w:t>
             </w:r>
           </w:p>
         </w:tc>
@@ -19940,213 +22263,29 @@
               <w:pStyle w:val="Compact"/>
             </w:pPr>
             <w:r>
-              <w:t xml:space="preserve">HB1247</w:t>
-            </w:r>
-          </w:p>
-        </w:tc>
-        <w:tc>
-          <w:tcPr/>
-          <w:p>
-            <w:pPr>
-              <w:pStyle w:val="Compact"/>
-            </w:pPr>
-            <w:r>
-              <w:t xml:space="preserve">Conley</w:t>
-            </w:r>
-          </w:p>
-        </w:tc>
-        <w:tc>
-          <w:tcPr/>
-          <w:p>
-            <w:pPr>
-              <w:pStyle w:val="Compact"/>
-            </w:pPr>
-            <w:r>
-              <w:t xml:space="preserve">Conley (?), Griffith (?), Telerski (?), Schultz (?), Chase (?), Vincent (?), Wazir (?), Kenney (?)</w:t>
-            </w:r>
-          </w:p>
-        </w:tc>
-      </w:tr>
-      <w:tr>
-        <w:tc>
-          <w:tcPr/>
-          <w:p>
-            <w:pPr>
-              <w:pStyle w:val="Compact"/>
-            </w:pPr>
-            <w:r>
-              <w:t xml:space="preserve">2020</w:t>
-            </w:r>
-          </w:p>
-        </w:tc>
-        <w:tc>
-          <w:tcPr/>
-          <w:p>
-            <w:pPr>
-              <w:pStyle w:val="Compact"/>
-            </w:pPr>
-            <w:r>
-              <w:t xml:space="preserve">HB1391</w:t>
-            </w:r>
-          </w:p>
-        </w:tc>
-        <w:tc>
-          <w:tcPr/>
-          <w:p>
-            <w:pPr>
-              <w:pStyle w:val="Compact"/>
-            </w:pPr>
-            <w:r>
-              <w:t xml:space="preserve">Read</w:t>
-            </w:r>
-          </w:p>
-        </w:tc>
-        <w:tc>
-          <w:tcPr/>
-          <w:p>
-            <w:pPr>
-              <w:pStyle w:val="Compact"/>
-            </w:pPr>
-            <w:r>
-              <w:t xml:space="preserve">Read (?), Schultz (?), Buchanan (?)</w:t>
-            </w:r>
-          </w:p>
-        </w:tc>
-      </w:tr>
-      <w:tr>
-        <w:tc>
-          <w:tcPr/>
-          <w:p>
-            <w:pPr>
-              <w:pStyle w:val="Compact"/>
-            </w:pPr>
-            <w:r>
-              <w:t xml:space="preserve">2020</w:t>
-            </w:r>
-          </w:p>
-        </w:tc>
-        <w:tc>
-          <w:tcPr/>
-          <w:p>
-            <w:pPr>
-              <w:pStyle w:val="Compact"/>
-            </w:pPr>
-            <w:r>
-              <w:t xml:space="preserve">HB1582</w:t>
-            </w:r>
-          </w:p>
-        </w:tc>
-        <w:tc>
-          <w:tcPr/>
-          <w:p>
-            <w:pPr>
-              <w:pStyle w:val="Compact"/>
-            </w:pPr>
-            <w:r>
-              <w:t xml:space="preserve">Roy</w:t>
-            </w:r>
-          </w:p>
-        </w:tc>
-        <w:tc>
-          <w:tcPr/>
-          <w:p>
-            <w:pPr>
-              <w:pStyle w:val="Compact"/>
-            </w:pPr>
-            <w:r>
-              <w:t xml:space="preserve">Roy (?), Aron (?)</w:t>
-            </w:r>
-          </w:p>
-        </w:tc>
-      </w:tr>
-      <w:tr>
-        <w:tc>
-          <w:tcPr/>
-          <w:p>
-            <w:pPr>
-              <w:pStyle w:val="Compact"/>
-            </w:pPr>
-            <w:r>
-              <w:t xml:space="preserve">2020</w:t>
-            </w:r>
-          </w:p>
-        </w:tc>
-        <w:tc>
-          <w:tcPr/>
-          <w:p>
-            <w:pPr>
-              <w:pStyle w:val="Compact"/>
-            </w:pPr>
-            <w:r>
-              <w:t xml:space="preserve">HB1629</w:t>
-            </w:r>
-          </w:p>
-        </w:tc>
-        <w:tc>
-          <w:tcPr/>
-          <w:p>
-            <w:pPr>
-              <w:pStyle w:val="Compact"/>
-            </w:pPr>
-            <w:r>
-              <w:t xml:space="preserve">Griffith</w:t>
-            </w:r>
-          </w:p>
-        </w:tc>
-        <w:tc>
-          <w:tcPr/>
-          <w:p>
-            <w:pPr>
-              <w:pStyle w:val="Compact"/>
-            </w:pPr>
-            <w:r>
-              <w:t xml:space="preserve">Griffith (?), Alexander Jr. (?), Loughman (?), Lucas (?), Butler (?), Hennessey (?)</w:t>
-            </w:r>
-          </w:p>
-        </w:tc>
-      </w:tr>
-      <w:tr>
-        <w:tc>
-          <w:tcPr/>
-          <w:p>
-            <w:pPr>
-              <w:pStyle w:val="Compact"/>
-            </w:pPr>
-            <w:r>
-              <w:t xml:space="preserve">2020</w:t>
-            </w:r>
-          </w:p>
-        </w:tc>
-        <w:tc>
-          <w:tcPr/>
-          <w:p>
-            <w:pPr>
-              <w:pStyle w:val="Compact"/>
-            </w:pPr>
-            <w:r>
-              <w:t xml:space="preserve">SB726</w:t>
-            </w:r>
-          </w:p>
-        </w:tc>
-        <w:tc>
-          <w:tcPr/>
-          <w:p>
-            <w:pPr>
-              <w:pStyle w:val="Compact"/>
-            </w:pPr>
-            <w:r>
-              <w:t xml:space="preserve">Morgan</w:t>
-            </w:r>
-          </w:p>
-        </w:tc>
-        <w:tc>
-          <w:tcPr/>
-          <w:p>
-            <w:pPr>
-              <w:pStyle w:val="Compact"/>
-            </w:pPr>
-            <w:r>
-              <w:t xml:space="preserve">Morgan (?), Sherman (?), Bradley (?), Birdsell (?), D’Allesandro (?), Rosenwald (?), Fuller Clark (?), Cavanaugh (?), +6 more</w:t>
+              <w:t xml:space="preserve">SB735</w:t>
+            </w:r>
+          </w:p>
+        </w:tc>
+        <w:tc>
+          <w:tcPr/>
+          <w:p>
+            <w:pPr>
+              <w:pStyle w:val="Compact"/>
+            </w:pPr>
+            <w:r>
+              <w:t xml:space="preserve">Birdsell</w:t>
+            </w:r>
+          </w:p>
+        </w:tc>
+        <w:tc>
+          <w:tcPr/>
+          <w:p>
+            <w:pPr>
+              <w:pStyle w:val="Compact"/>
+            </w:pPr>
+            <w:r>
+              <w:t xml:space="preserve">Birdsell (?), Sherman (?), Dietsch (?), Ward (?), O’Connor (?), B. Griffin (?), Edwards (?), Gould (?), +1 more</w:t>
             </w:r>
           </w:p>
         </w:tc>
@@ -20170,29 +22309,29 @@
               <w:pStyle w:val="Compact"/>
             </w:pPr>
             <w:r>
-              <w:t xml:space="preserve">HB503</w:t>
-            </w:r>
-          </w:p>
-        </w:tc>
-        <w:tc>
-          <w:tcPr/>
-          <w:p>
-            <w:pPr>
-              <w:pStyle w:val="Compact"/>
-            </w:pPr>
-            <w:r>
-              <w:t xml:space="preserve">Long</w:t>
-            </w:r>
-          </w:p>
-        </w:tc>
-        <w:tc>
-          <w:tcPr/>
-          <w:p>
-            <w:pPr>
-              <w:pStyle w:val="Compact"/>
-            </w:pPr>
-            <w:r>
-              <w:t xml:space="preserve">Long (?), Wilhelm (?)</w:t>
+              <w:t xml:space="preserve">HB284</w:t>
+            </w:r>
+          </w:p>
+        </w:tc>
+        <w:tc>
+          <w:tcPr/>
+          <w:p>
+            <w:pPr>
+              <w:pStyle w:val="Compact"/>
+            </w:pPr>
+            <w:r>
+              <w:t xml:space="preserve">McBeath</w:t>
+            </w:r>
+          </w:p>
+        </w:tc>
+        <w:tc>
+          <w:tcPr/>
+          <w:p>
+            <w:pPr>
+              <w:pStyle w:val="Compact"/>
+            </w:pPr>
+            <w:r>
+              <w:t xml:space="preserve">McBeath (?)</w:t>
             </w:r>
           </w:p>
         </w:tc>
@@ -20216,29 +22355,29 @@
               <w:pStyle w:val="Compact"/>
             </w:pPr>
             <w:r>
-              <w:t xml:space="preserve">HB586</w:t>
-            </w:r>
-          </w:p>
-        </w:tc>
-        <w:tc>
-          <w:tcPr/>
-          <w:p>
-            <w:pPr>
-              <w:pStyle w:val="Compact"/>
-            </w:pPr>
-            <w:r>
-              <w:t xml:space="preserve">Alexander Jr.</w:t>
-            </w:r>
-          </w:p>
-        </w:tc>
-        <w:tc>
-          <w:tcPr/>
-          <w:p>
-            <w:pPr>
-              <w:pStyle w:val="Compact"/>
-            </w:pPr>
-            <w:r>
-              <w:t xml:space="preserve">Alexander Jr. (?), Lascelles (?), Burroughs (?), Umberger (?), Griffith (?), Hennessey (?), Perkins Kwoka (?)</w:t>
+              <w:t xml:space="preserve">HB286</w:t>
+            </w:r>
+          </w:p>
+        </w:tc>
+        <w:tc>
+          <w:tcPr/>
+          <w:p>
+            <w:pPr>
+              <w:pStyle w:val="Compact"/>
+            </w:pPr>
+            <w:r>
+              <w:t xml:space="preserve">Klein-Knight</w:t>
+            </w:r>
+          </w:p>
+        </w:tc>
+        <w:tc>
+          <w:tcPr/>
+          <w:p>
+            <w:pPr>
+              <w:pStyle w:val="Compact"/>
+            </w:pPr>
+            <w:r>
+              <w:t xml:space="preserve">Klein-Knight (?), Moran (?), Massimilla (?), Griffith (?), Labranche (?), Oxaal (?), Bouchard (?), Stevens (?)</w:t>
             </w:r>
           </w:p>
         </w:tc>
@@ -20262,29 +22401,29 @@
               <w:pStyle w:val="Compact"/>
             </w:pPr>
             <w:r>
-              <w:t xml:space="preserve">HB610</w:t>
-            </w:r>
-          </w:p>
-        </w:tc>
-        <w:tc>
-          <w:tcPr/>
-          <w:p>
-            <w:pPr>
-              <w:pStyle w:val="Compact"/>
-            </w:pPr>
-            <w:r>
-              <w:t xml:space="preserve">Hunt</w:t>
-            </w:r>
-          </w:p>
-        </w:tc>
-        <w:tc>
-          <w:tcPr/>
-          <w:p>
-            <w:pPr>
-              <w:pStyle w:val="Compact"/>
-            </w:pPr>
-            <w:r>
-              <w:t xml:space="preserve">Hunt (?)</w:t>
+              <w:t xml:space="preserve">HB332</w:t>
+            </w:r>
+          </w:p>
+        </w:tc>
+        <w:tc>
+          <w:tcPr/>
+          <w:p>
+            <w:pPr>
+              <w:pStyle w:val="Compact"/>
+            </w:pPr>
+            <w:r>
+              <w:t xml:space="preserve">Seaworth</w:t>
+            </w:r>
+          </w:p>
+        </w:tc>
+        <w:tc>
+          <w:tcPr/>
+          <w:p>
+            <w:pPr>
+              <w:pStyle w:val="Compact"/>
+            </w:pPr>
+            <w:r>
+              <w:t xml:space="preserve">Seaworth (?), Birdsell (?)</w:t>
             </w:r>
           </w:p>
         </w:tc>
@@ -20308,7 +22447,53 @@
               <w:pStyle w:val="Compact"/>
             </w:pPr>
             <w:r>
-              <w:t xml:space="preserve">SB126</w:t>
+              <w:t xml:space="preserve">HB377</w:t>
+            </w:r>
+          </w:p>
+        </w:tc>
+        <w:tc>
+          <w:tcPr/>
+          <w:p>
+            <w:pPr>
+              <w:pStyle w:val="Compact"/>
+            </w:pPr>
+            <w:r>
+              <w:t xml:space="preserve">Connors</w:t>
+            </w:r>
+          </w:p>
+        </w:tc>
+        <w:tc>
+          <w:tcPr/>
+          <w:p>
+            <w:pPr>
+              <w:pStyle w:val="Compact"/>
+            </w:pPr>
+            <w:r>
+              <w:t xml:space="preserve">Connors (?), Cornell (?), Goley (?), Snow (?), D’Allesandro (?)</w:t>
+            </w:r>
+          </w:p>
+        </w:tc>
+      </w:tr>
+      <w:tr>
+        <w:tc>
+          <w:tcPr/>
+          <w:p>
+            <w:pPr>
+              <w:pStyle w:val="Compact"/>
+            </w:pPr>
+            <w:r>
+              <w:t xml:space="preserve">2021</w:t>
+            </w:r>
+          </w:p>
+        </w:tc>
+        <w:tc>
+          <w:tcPr/>
+          <w:p>
+            <w:pPr>
+              <w:pStyle w:val="Compact"/>
+            </w:pPr>
+            <w:r>
+              <w:t xml:space="preserve">SB102</w:t>
             </w:r>
           </w:p>
         </w:tc>
@@ -20331,144 +22516,6 @@
             </w:pPr>
             <w:r>
               <w:t xml:space="preserve">Perkins Kwoka (?)</w:t>
-            </w:r>
-          </w:p>
-        </w:tc>
-      </w:tr>
-      <w:tr>
-        <w:tc>
-          <w:tcPr/>
-          <w:p>
-            <w:pPr>
-              <w:pStyle w:val="Compact"/>
-            </w:pPr>
-            <w:r>
-              <w:t xml:space="preserve">2021</w:t>
-            </w:r>
-          </w:p>
-        </w:tc>
-        <w:tc>
-          <w:tcPr/>
-          <w:p>
-            <w:pPr>
-              <w:pStyle w:val="Compact"/>
-            </w:pPr>
-            <w:r>
-              <w:t xml:space="preserve">SB152</w:t>
-            </w:r>
-          </w:p>
-        </w:tc>
-        <w:tc>
-          <w:tcPr/>
-          <w:p>
-            <w:pPr>
-              <w:pStyle w:val="Compact"/>
-            </w:pPr>
-            <w:r>
-              <w:t xml:space="preserve">Gray</w:t>
-            </w:r>
-          </w:p>
-        </w:tc>
-        <w:tc>
-          <w:tcPr/>
-          <w:p>
-            <w:pPr>
-              <w:pStyle w:val="Compact"/>
-            </w:pPr>
-            <w:r>
-              <w:t xml:space="preserve">Gray (?)</w:t>
-            </w:r>
-          </w:p>
-        </w:tc>
-      </w:tr>
-      <w:tr>
-        <w:tc>
-          <w:tcPr/>
-          <w:p>
-            <w:pPr>
-              <w:pStyle w:val="Compact"/>
-            </w:pPr>
-            <w:r>
-              <w:t xml:space="preserve">2021</w:t>
-            </w:r>
-          </w:p>
-        </w:tc>
-        <w:tc>
-          <w:tcPr/>
-          <w:p>
-            <w:pPr>
-              <w:pStyle w:val="Compact"/>
-            </w:pPr>
-            <w:r>
-              <w:t xml:space="preserve">SB73</w:t>
-            </w:r>
-          </w:p>
-        </w:tc>
-        <w:tc>
-          <w:tcPr/>
-          <w:p>
-            <w:pPr>
-              <w:pStyle w:val="Compact"/>
-            </w:pPr>
-            <w:r>
-              <w:t xml:space="preserve">Soucy</w:t>
-            </w:r>
-          </w:p>
-        </w:tc>
-        <w:tc>
-          <w:tcPr/>
-          <w:p>
-            <w:pPr>
-              <w:pStyle w:val="Compact"/>
-            </w:pPr>
-            <w:r>
-              <w:t xml:space="preserve">Soucy (?), Watters (?), Perkins Kwoka (?), Cavanaugh (?), McWilliams (?)</w:t>
-            </w:r>
-          </w:p>
-        </w:tc>
-      </w:tr>
-      <w:tr>
-        <w:tc>
-          <w:tcPr/>
-          <w:p>
-            <w:pPr>
-              <w:pStyle w:val="Compact"/>
-            </w:pPr>
-            <w:r>
-              <w:t xml:space="preserve">2021</w:t>
-            </w:r>
-          </w:p>
-        </w:tc>
-        <w:tc>
-          <w:tcPr/>
-          <w:p>
-            <w:pPr>
-              <w:pStyle w:val="Compact"/>
-            </w:pPr>
-            <w:r>
-              <w:t xml:space="preserve">SB86</w:t>
-            </w:r>
-          </w:p>
-        </w:tc>
-        <w:tc>
-          <w:tcPr/>
-          <w:p>
-            <w:pPr>
-              <w:pStyle w:val="Compact"/>
-            </w:pPr>
-            <w:r>
-              <w:t xml:space="preserve">Kahn</w:t>
-            </w:r>
-          </w:p>
-        </w:tc>
-        <w:tc>
-          <w:tcPr/>
-          <w:p>
-            <w:pPr>
-              <w:pStyle w:val="Compact"/>
-            </w:pPr>
-            <w:r>
-              <w:t xml:space="preserve">Kahn (?)</w:t>
             </w:r>
           </w:p>
         </w:tc>
@@ -25383,6 +27430,41 @@
               <w:pStyle w:val="Compact"/>
             </w:pPr>
             <w:r>
+              <w:t xml:space="preserve">SB721</w:t>
+            </w:r>
+          </w:p>
+        </w:tc>
+        <w:tc>
+          <w:tcPr/>
+          <w:p>
+            <w:pPr>
+              <w:pStyle w:val="Compact"/>
+            </w:pPr>
+            <w:r>
+              <w:t xml:space="preserve">died mid-process (latest official text: As Introduced)</w:t>
+            </w:r>
+          </w:p>
+        </w:tc>
+      </w:tr>
+      <w:tr>
+        <w:tc>
+          <w:tcPr/>
+          <w:p>
+            <w:pPr>
+              <w:pStyle w:val="Compact"/>
+            </w:pPr>
+            <w:r>
+              <w:t xml:space="preserve">2020</w:t>
+            </w:r>
+          </w:p>
+        </w:tc>
+        <w:tc>
+          <w:tcPr/>
+          <w:p>
+            <w:pPr>
+              <w:pStyle w:val="Compact"/>
+            </w:pPr>
+            <w:r>
               <w:t xml:space="preserve">SB726</w:t>
             </w:r>
           </w:p>
@@ -25407,6 +27489,41 @@
               <w:pStyle w:val="Compact"/>
             </w:pPr>
             <w:r>
+              <w:t xml:space="preserve">2020</w:t>
+            </w:r>
+          </w:p>
+        </w:tc>
+        <w:tc>
+          <w:tcPr/>
+          <w:p>
+            <w:pPr>
+              <w:pStyle w:val="Compact"/>
+            </w:pPr>
+            <w:r>
+              <w:t xml:space="preserve">SB735</w:t>
+            </w:r>
+          </w:p>
+        </w:tc>
+        <w:tc>
+          <w:tcPr/>
+          <w:p>
+            <w:pPr>
+              <w:pStyle w:val="Compact"/>
+            </w:pPr>
+            <w:r>
+              <w:t xml:space="preserve">died mid-process (latest official text: As Introduced)</w:t>
+            </w:r>
+          </w:p>
+        </w:tc>
+      </w:tr>
+      <w:tr>
+        <w:tc>
+          <w:tcPr/>
+          <w:p>
+            <w:pPr>
+              <w:pStyle w:val="Compact"/>
+            </w:pPr>
+            <w:r>
               <w:t xml:space="preserve">2021</w:t>
             </w:r>
           </w:p>
@@ -25418,6 +27535,146 @@
               <w:pStyle w:val="Compact"/>
             </w:pPr>
             <w:r>
+              <w:t xml:space="preserve">HB284</w:t>
+            </w:r>
+          </w:p>
+        </w:tc>
+        <w:tc>
+          <w:tcPr/>
+          <w:p>
+            <w:pPr>
+              <w:pStyle w:val="Compact"/>
+            </w:pPr>
+            <w:r>
+              <w:t xml:space="preserve">became law (Laws of 2021, Chapter 136)</w:t>
+            </w:r>
+          </w:p>
+        </w:tc>
+      </w:tr>
+      <w:tr>
+        <w:tc>
+          <w:tcPr/>
+          <w:p>
+            <w:pPr>
+              <w:pStyle w:val="Compact"/>
+            </w:pPr>
+            <w:r>
+              <w:t xml:space="preserve">2021</w:t>
+            </w:r>
+          </w:p>
+        </w:tc>
+        <w:tc>
+          <w:tcPr/>
+          <w:p>
+            <w:pPr>
+              <w:pStyle w:val="Compact"/>
+            </w:pPr>
+            <w:r>
+              <w:t xml:space="preserve">HB286</w:t>
+            </w:r>
+          </w:p>
+        </w:tc>
+        <w:tc>
+          <w:tcPr/>
+          <w:p>
+            <w:pPr>
+              <w:pStyle w:val="Compact"/>
+            </w:pPr>
+            <w:r>
+              <w:t xml:space="preserve">became law (Laws of 2021, Chapter 39)</w:t>
+            </w:r>
+          </w:p>
+        </w:tc>
+      </w:tr>
+      <w:tr>
+        <w:tc>
+          <w:tcPr/>
+          <w:p>
+            <w:pPr>
+              <w:pStyle w:val="Compact"/>
+            </w:pPr>
+            <w:r>
+              <w:t xml:space="preserve">2021</w:t>
+            </w:r>
+          </w:p>
+        </w:tc>
+        <w:tc>
+          <w:tcPr/>
+          <w:p>
+            <w:pPr>
+              <w:pStyle w:val="Compact"/>
+            </w:pPr>
+            <w:r>
+              <w:t xml:space="preserve">HB332</w:t>
+            </w:r>
+          </w:p>
+        </w:tc>
+        <w:tc>
+          <w:tcPr/>
+          <w:p>
+            <w:pPr>
+              <w:pStyle w:val="Compact"/>
+            </w:pPr>
+            <w:r>
+              <w:t xml:space="preserve">became law (Laws of 2021, Chapter 69)</w:t>
+            </w:r>
+          </w:p>
+        </w:tc>
+      </w:tr>
+      <w:tr>
+        <w:tc>
+          <w:tcPr/>
+          <w:p>
+            <w:pPr>
+              <w:pStyle w:val="Compact"/>
+            </w:pPr>
+            <w:r>
+              <w:t xml:space="preserve">2021</w:t>
+            </w:r>
+          </w:p>
+        </w:tc>
+        <w:tc>
+          <w:tcPr/>
+          <w:p>
+            <w:pPr>
+              <w:pStyle w:val="Compact"/>
+            </w:pPr>
+            <w:r>
+              <w:t xml:space="preserve">HB377</w:t>
+            </w:r>
+          </w:p>
+        </w:tc>
+        <w:tc>
+          <w:tcPr/>
+          <w:p>
+            <w:pPr>
+              <w:pStyle w:val="Compact"/>
+            </w:pPr>
+            <w:r>
+              <w:t xml:space="preserve">became law (Laws of 2021, Chapter 26)</w:t>
+            </w:r>
+          </w:p>
+        </w:tc>
+      </w:tr>
+      <w:tr>
+        <w:tc>
+          <w:tcPr/>
+          <w:p>
+            <w:pPr>
+              <w:pStyle w:val="Compact"/>
+            </w:pPr>
+            <w:r>
+              <w:t xml:space="preserve">2021</w:t>
+            </w:r>
+          </w:p>
+        </w:tc>
+        <w:tc>
+          <w:tcPr/>
+          <w:p>
+            <w:pPr>
+              <w:pStyle w:val="Compact"/>
+            </w:pPr>
+            <w:r>
               <w:t xml:space="preserve">HB503</w:t>
             </w:r>
           </w:p>
@@ -25429,7 +27686,7 @@
               <w:pStyle w:val="Compact"/>
             </w:pPr>
             <w:r>
-              <w:t xml:space="preserve">Retained into the second year of the biennium; passed in 2022 and became Chapter 251 of the Laws of 2022 (effective 2022-06-24), codifying the state Council on Housing Stability (plus telehealth provisions). The 2021 Hou</w:t>
+              <w:t xml:space="preserve">became law (Laws of 2021, Chapter 4)</w:t>
             </w:r>
           </w:p>
         </w:tc>
@@ -25523,6 +27780,41 @@
               <w:pStyle w:val="Compact"/>
             </w:pPr>
             <w:r>
+              <w:t xml:space="preserve">SB102</w:t>
+            </w:r>
+          </w:p>
+        </w:tc>
+        <w:tc>
+          <w:tcPr/>
+          <w:p>
+            <w:pPr>
+              <w:pStyle w:val="Compact"/>
+            </w:pPr>
+            <w:r>
+              <w:t xml:space="preserve">became law (Laws of 2021, Chapter 200)</w:t>
+            </w:r>
+          </w:p>
+        </w:tc>
+      </w:tr>
+      <w:tr>
+        <w:tc>
+          <w:tcPr/>
+          <w:p>
+            <w:pPr>
+              <w:pStyle w:val="Compact"/>
+            </w:pPr>
+            <w:r>
+              <w:t xml:space="preserve">2021</w:t>
+            </w:r>
+          </w:p>
+        </w:tc>
+        <w:tc>
+          <w:tcPr/>
+          <w:p>
+            <w:pPr>
+              <w:pStyle w:val="Compact"/>
+            </w:pPr>
+            <w:r>
               <w:t xml:space="preserve">SB126</w:t>
             </w:r>
           </w:p>
@@ -25663,6 +27955,41 @@
               <w:pStyle w:val="Compact"/>
             </w:pPr>
             <w:r>
+              <w:t xml:space="preserve">HB1021</w:t>
+            </w:r>
+          </w:p>
+        </w:tc>
+        <w:tc>
+          <w:tcPr/>
+          <w:p>
+            <w:pPr>
+              <w:pStyle w:val="Compact"/>
+            </w:pPr>
+            <w:r>
+              <w:t xml:space="preserve">House concurred with the Senate amendment 2022-05-13 (voice vote); became law: Laws of 2022, Chapter 291 (NHMA Final Legislative Bulletin 2022: local regulations on primarily religious use of land restricted).</w:t>
+            </w:r>
+          </w:p>
+        </w:tc>
+      </w:tr>
+      <w:tr>
+        <w:tc>
+          <w:tcPr/>
+          <w:p>
+            <w:pPr>
+              <w:pStyle w:val="Compact"/>
+            </w:pPr>
+            <w:r>
+              <w:t xml:space="preserve">2022</w:t>
+            </w:r>
+          </w:p>
+        </w:tc>
+        <w:tc>
+          <w:tcPr/>
+          <w:p>
+            <w:pPr>
+              <w:pStyle w:val="Compact"/>
+            </w:pPr>
+            <w:r>
               <w:t xml:space="preserve">HB1291</w:t>
             </w:r>
           </w:p>
@@ -25698,6 +28025,41 @@
               <w:pStyle w:val="Compact"/>
             </w:pPr>
             <w:r>
+              <w:t xml:space="preserve">HB1661</w:t>
+            </w:r>
+          </w:p>
+        </w:tc>
+        <w:tc>
+          <w:tcPr/>
+          <w:p>
+            <w:pPr>
+              <w:pStyle w:val="Compact"/>
+            </w:pPr>
+            <w:r>
+              <w:t xml:space="preserve">became law (Chapter 272)</w:t>
+            </w:r>
+          </w:p>
+        </w:tc>
+      </w:tr>
+      <w:tr>
+        <w:tc>
+          <w:tcPr/>
+          <w:p>
+            <w:pPr>
+              <w:pStyle w:val="Compact"/>
+            </w:pPr>
+            <w:r>
+              <w:t xml:space="preserve">2022</w:t>
+            </w:r>
+          </w:p>
+        </w:tc>
+        <w:tc>
+          <w:tcPr/>
+          <w:p>
+            <w:pPr>
+              <w:pStyle w:val="Compact"/>
+            </w:pPr>
+            <w:r>
               <w:t xml:space="preserve">HB1662</w:t>
             </w:r>
           </w:p>
@@ -25733,6 +28095,76 @@
               <w:pStyle w:val="Compact"/>
             </w:pPr>
             <w:r>
+              <w:t xml:space="preserve">SB223</w:t>
+            </w:r>
+          </w:p>
+        </w:tc>
+        <w:tc>
+          <w:tcPr/>
+          <w:p>
+            <w:pPr>
+              <w:pStyle w:val="Compact"/>
+            </w:pPr>
+            <w:r>
+              <w:t xml:space="preserve">Became law: Laws of 2022, Chapter 88 (NHMA Final Legislative Bulletin 2022).</w:t>
+            </w:r>
+          </w:p>
+        </w:tc>
+      </w:tr>
+      <w:tr>
+        <w:tc>
+          <w:tcPr/>
+          <w:p>
+            <w:pPr>
+              <w:pStyle w:val="Compact"/>
+            </w:pPr>
+            <w:r>
+              <w:t xml:space="preserve">2022</w:t>
+            </w:r>
+          </w:p>
+        </w:tc>
+        <w:tc>
+          <w:tcPr/>
+          <w:p>
+            <w:pPr>
+              <w:pStyle w:val="Compact"/>
+            </w:pPr>
+            <w:r>
+              <w:t xml:space="preserve">SB334</w:t>
+            </w:r>
+          </w:p>
+        </w:tc>
+        <w:tc>
+          <w:tcPr/>
+          <w:p>
+            <w:pPr>
+              <w:pStyle w:val="Compact"/>
+            </w:pPr>
+            <w:r>
+              <w:t xml:space="preserve">Became law: Laws of 2022, Chapter 167 (NHMA Final Legislative Bulletin 2022).</w:t>
+            </w:r>
+          </w:p>
+        </w:tc>
+      </w:tr>
+      <w:tr>
+        <w:tc>
+          <w:tcPr/>
+          <w:p>
+            <w:pPr>
+              <w:pStyle w:val="Compact"/>
+            </w:pPr>
+            <w:r>
+              <w:t xml:space="preserve">2022</w:t>
+            </w:r>
+          </w:p>
+        </w:tc>
+        <w:tc>
+          <w:tcPr/>
+          <w:p>
+            <w:pPr>
+              <w:pStyle w:val="Compact"/>
+            </w:pPr>
+            <w:r>
               <w:t xml:space="preserve">SB400</w:t>
             </w:r>
           </w:p>
@@ -25873,6 +28305,41 @@
               <w:pStyle w:val="Compact"/>
             </w:pPr>
             <w:r>
+              <w:t xml:space="preserve">HB296</w:t>
+            </w:r>
+          </w:p>
+        </w:tc>
+        <w:tc>
+          <w:tcPr/>
+          <w:p>
+            <w:pPr>
+              <w:pStyle w:val="Compact"/>
+            </w:pPr>
+            <w:r>
+              <w:t xml:space="preserve">Became law: Laws of 2023, Chapter 187 (NHMA Final Legislative Bulletin 2023: residential driveway authority altered).</w:t>
+            </w:r>
+          </w:p>
+        </w:tc>
+      </w:tr>
+      <w:tr>
+        <w:tc>
+          <w:tcPr/>
+          <w:p>
+            <w:pPr>
+              <w:pStyle w:val="Compact"/>
+            </w:pPr>
+            <w:r>
+              <w:t xml:space="preserve">2023</w:t>
+            </w:r>
+          </w:p>
+        </w:tc>
+        <w:tc>
+          <w:tcPr/>
+          <w:p>
+            <w:pPr>
+              <w:pStyle w:val="Compact"/>
+            </w:pPr>
+            <w:r>
               <w:t xml:space="preserve">HB401</w:t>
             </w:r>
           </w:p>
@@ -25908,6 +28375,76 @@
               <w:pStyle w:val="Compact"/>
             </w:pPr>
             <w:r>
+              <w:t xml:space="preserve">HB42</w:t>
+            </w:r>
+          </w:p>
+        </w:tc>
+        <w:tc>
+          <w:tcPr/>
+          <w:p>
+            <w:pPr>
+              <w:pStyle w:val="Compact"/>
+            </w:pPr>
+            <w:r>
+              <w:t xml:space="preserve">became law (Chapter 114)</w:t>
+            </w:r>
+          </w:p>
+        </w:tc>
+      </w:tr>
+      <w:tr>
+        <w:tc>
+          <w:tcPr/>
+          <w:p>
+            <w:pPr>
+              <w:pStyle w:val="Compact"/>
+            </w:pPr>
+            <w:r>
+              <w:t xml:space="preserve">2023</w:t>
+            </w:r>
+          </w:p>
+        </w:tc>
+        <w:tc>
+          <w:tcPr/>
+          <w:p>
+            <w:pPr>
+              <w:pStyle w:val="Compact"/>
+            </w:pPr>
+            <w:r>
+              <w:t xml:space="preserve">HB44</w:t>
+            </w:r>
+          </w:p>
+        </w:tc>
+        <w:tc>
+          <w:tcPr/>
+          <w:p>
+            <w:pPr>
+              <w:pStyle w:val="Compact"/>
+            </w:pPr>
+            <w:r>
+              <w:t xml:space="preserve">Killed on the House floor 2023-02-23: Ought to Pass failed 117-232 (SQL roll call), then Inexpedient to Legislate adopted by division vote 209-141 (House Journal 7). The bill would have allowed 4 residential units by rig</w:t>
+            </w:r>
+          </w:p>
+        </w:tc>
+      </w:tr>
+      <w:tr>
+        <w:tc>
+          <w:tcPr/>
+          <w:p>
+            <w:pPr>
+              <w:pStyle w:val="Compact"/>
+            </w:pPr>
+            <w:r>
+              <w:t xml:space="preserve">2023</w:t>
+            </w:r>
+          </w:p>
+        </w:tc>
+        <w:tc>
+          <w:tcPr/>
+          <w:p>
+            <w:pPr>
+              <w:pStyle w:val="Compact"/>
+            </w:pPr>
+            <w:r>
               <w:t xml:space="preserve">HB469</w:t>
             </w:r>
           </w:p>
@@ -26107,6 +28644,41 @@
               <w:pStyle w:val="Compact"/>
             </w:pPr>
             <w:r>
+              <w:t xml:space="preserve">2023</w:t>
+            </w:r>
+          </w:p>
+        </w:tc>
+        <w:tc>
+          <w:tcPr/>
+          <w:p>
+            <w:pPr>
+              <w:pStyle w:val="Compact"/>
+            </w:pPr>
+            <w:r>
+              <w:t xml:space="preserve">SB231</w:t>
+            </w:r>
+          </w:p>
+        </w:tc>
+        <w:tc>
+          <w:tcPr/>
+          <w:p>
+            <w:pPr>
+              <w:pStyle w:val="Compact"/>
+            </w:pPr>
+            <w:r>
+              <w:t xml:space="preserve">Standalone bill did not pass as such; its provisions were enacted through HB2, the 2023 budget trailer (Chapter Law 79:39-43 - InvestNH and Affordable Housing Fund appropriations - and 79:564-565 - shelter funding), sign</w:t>
+            </w:r>
+          </w:p>
+        </w:tc>
+      </w:tr>
+      <w:tr>
+        <w:tc>
+          <w:tcPr/>
+          <w:p>
+            <w:pPr>
+              <w:pStyle w:val="Compact"/>
+            </w:pPr>
+            <w:r>
               <w:t xml:space="preserve">2024</w:t>
             </w:r>
           </w:p>
@@ -26118,6 +28690,41 @@
               <w:pStyle w:val="Compact"/>
             </w:pPr>
             <w:r>
+              <w:t xml:space="preserve">HB1065</w:t>
+            </w:r>
+          </w:p>
+        </w:tc>
+        <w:tc>
+          <w:tcPr/>
+          <w:p>
+            <w:pPr>
+              <w:pStyle w:val="Compact"/>
+            </w:pPr>
+            <w:r>
+              <w:t xml:space="preserve">became law (Chapter 324)</w:t>
+            </w:r>
+          </w:p>
+        </w:tc>
+      </w:tr>
+      <w:tr>
+        <w:tc>
+          <w:tcPr/>
+          <w:p>
+            <w:pPr>
+              <w:pStyle w:val="Compact"/>
+            </w:pPr>
+            <w:r>
+              <w:t xml:space="preserve">2024</w:t>
+            </w:r>
+          </w:p>
+        </w:tc>
+        <w:tc>
+          <w:tcPr/>
+          <w:p>
+            <w:pPr>
+              <w:pStyle w:val="Compact"/>
+            </w:pPr>
+            <w:r>
               <w:t xml:space="preserve">HB1199</w:t>
             </w:r>
           </w:p>
@@ -26153,6 +28760,41 @@
               <w:pStyle w:val="Compact"/>
             </w:pPr>
             <w:r>
+              <w:t xml:space="preserve">HB1202</w:t>
+            </w:r>
+          </w:p>
+        </w:tc>
+        <w:tc>
+          <w:tcPr/>
+          <w:p>
+            <w:pPr>
+              <w:pStyle w:val="Compact"/>
+            </w:pPr>
+            <w:r>
+              <w:t xml:space="preserve">became law (Chapter 367)</w:t>
+            </w:r>
+          </w:p>
+        </w:tc>
+      </w:tr>
+      <w:tr>
+        <w:tc>
+          <w:tcPr/>
+          <w:p>
+            <w:pPr>
+              <w:pStyle w:val="Compact"/>
+            </w:pPr>
+            <w:r>
+              <w:t xml:space="preserve">2024</w:t>
+            </w:r>
+          </w:p>
+        </w:tc>
+        <w:tc>
+          <w:tcPr/>
+          <w:p>
+            <w:pPr>
+              <w:pStyle w:val="Compact"/>
+            </w:pPr>
+            <w:r>
               <w:t xml:space="preserve">HB1291</w:t>
             </w:r>
           </w:p>
@@ -26223,6 +28865,41 @@
               <w:pStyle w:val="Compact"/>
             </w:pPr>
             <w:r>
+              <w:t xml:space="preserve">HB1361</w:t>
+            </w:r>
+          </w:p>
+        </w:tc>
+        <w:tc>
+          <w:tcPr/>
+          <w:p>
+            <w:pPr>
+              <w:pStyle w:val="Compact"/>
+            </w:pPr>
+            <w:r>
+              <w:t xml:space="preserve">became law (Chapter 23)</w:t>
+            </w:r>
+          </w:p>
+        </w:tc>
+      </w:tr>
+      <w:tr>
+        <w:tc>
+          <w:tcPr/>
+          <w:p>
+            <w:pPr>
+              <w:pStyle w:val="Compact"/>
+            </w:pPr>
+            <w:r>
+              <w:t xml:space="preserve">2024</w:t>
+            </w:r>
+          </w:p>
+        </w:tc>
+        <w:tc>
+          <w:tcPr/>
+          <w:p>
+            <w:pPr>
+              <w:pStyle w:val="Compact"/>
+            </w:pPr>
+            <w:r>
               <w:t xml:space="preserve">HB1396</w:t>
             </w:r>
           </w:p>
@@ -26258,6 +28935,76 @@
               <w:pStyle w:val="Compact"/>
             </w:pPr>
             <w:r>
+              <w:t xml:space="preserve">HB1399</w:t>
+            </w:r>
+          </w:p>
+        </w:tc>
+        <w:tc>
+          <w:tcPr/>
+          <w:p>
+            <w:pPr>
+              <w:pStyle w:val="Compact"/>
+            </w:pPr>
+            <w:r>
+              <w:t xml:space="preserve">sent to interim study by the Senate</w:t>
+            </w:r>
+          </w:p>
+        </w:tc>
+      </w:tr>
+      <w:tr>
+        <w:tc>
+          <w:tcPr/>
+          <w:p>
+            <w:pPr>
+              <w:pStyle w:val="Compact"/>
+            </w:pPr>
+            <w:r>
+              <w:t xml:space="preserve">2024</w:t>
+            </w:r>
+          </w:p>
+        </w:tc>
+        <w:tc>
+          <w:tcPr/>
+          <w:p>
+            <w:pPr>
+              <w:pStyle w:val="Compact"/>
+            </w:pPr>
+            <w:r>
+              <w:t xml:space="preserve">HB1400</w:t>
+            </w:r>
+          </w:p>
+        </w:tc>
+        <w:tc>
+          <w:tcPr/>
+          <w:p>
+            <w:pPr>
+              <w:pStyle w:val="Compact"/>
+            </w:pPr>
+            <w:r>
+              <w:t xml:space="preserve">became law (Chapter 370)</w:t>
+            </w:r>
+          </w:p>
+        </w:tc>
+      </w:tr>
+      <w:tr>
+        <w:tc>
+          <w:tcPr/>
+          <w:p>
+            <w:pPr>
+              <w:pStyle w:val="Compact"/>
+            </w:pPr>
+            <w:r>
+              <w:t xml:space="preserve">2024</w:t>
+            </w:r>
+          </w:p>
+        </w:tc>
+        <w:tc>
+          <w:tcPr/>
+          <w:p>
+            <w:pPr>
+              <w:pStyle w:val="Compact"/>
+            </w:pPr>
+            <w:r>
               <w:t xml:space="preserve">HB1470</w:t>
             </w:r>
           </w:p>
@@ -26328,6 +29075,41 @@
               <w:pStyle w:val="Compact"/>
             </w:pPr>
             <w:r>
+              <w:t xml:space="preserve">HB1567</w:t>
+            </w:r>
+          </w:p>
+        </w:tc>
+        <w:tc>
+          <w:tcPr/>
+          <w:p>
+            <w:pPr>
+              <w:pStyle w:val="Compact"/>
+            </w:pPr>
+            <w:r>
+              <w:t xml:space="preserve">became law (Chapter 271)</w:t>
+            </w:r>
+          </w:p>
+        </w:tc>
+      </w:tr>
+      <w:tr>
+        <w:tc>
+          <w:tcPr/>
+          <w:p>
+            <w:pPr>
+              <w:pStyle w:val="Compact"/>
+            </w:pPr>
+            <w:r>
+              <w:t xml:space="preserve">2024</w:t>
+            </w:r>
+          </w:p>
+        </w:tc>
+        <w:tc>
+          <w:tcPr/>
+          <w:p>
+            <w:pPr>
+              <w:pStyle w:val="Compact"/>
+            </w:pPr>
+            <w:r>
               <w:t xml:space="preserve">SB318</w:t>
             </w:r>
           </w:p>
@@ -26340,6 +29122,76 @@
             </w:pPr>
             <w:r>
               <w:t xml:space="preserve">vetoed (no override action recorded as of collection)</w:t>
+            </w:r>
+          </w:p>
+        </w:tc>
+      </w:tr>
+      <w:tr>
+        <w:tc>
+          <w:tcPr/>
+          <w:p>
+            <w:pPr>
+              <w:pStyle w:val="Compact"/>
+            </w:pPr>
+            <w:r>
+              <w:t xml:space="preserve">2024</w:t>
+            </w:r>
+          </w:p>
+        </w:tc>
+        <w:tc>
+          <w:tcPr/>
+          <w:p>
+            <w:pPr>
+              <w:pStyle w:val="Compact"/>
+            </w:pPr>
+            <w:r>
+              <w:t xml:space="preserve">SB406</w:t>
+            </w:r>
+          </w:p>
+        </w:tc>
+        <w:tc>
+          <w:tcPr/>
+          <w:p>
+            <w:pPr>
+              <w:pStyle w:val="Compact"/>
+            </w:pPr>
+            <w:r>
+              <w:t xml:space="preserve">became law (Chapter 0290)</w:t>
+            </w:r>
+          </w:p>
+        </w:tc>
+      </w:tr>
+      <w:tr>
+        <w:tc>
+          <w:tcPr/>
+          <w:p>
+            <w:pPr>
+              <w:pStyle w:val="Compact"/>
+            </w:pPr>
+            <w:r>
+              <w:t xml:space="preserve">2024</w:t>
+            </w:r>
+          </w:p>
+        </w:tc>
+        <w:tc>
+          <w:tcPr/>
+          <w:p>
+            <w:pPr>
+              <w:pStyle w:val="Compact"/>
+            </w:pPr>
+            <w:r>
+              <w:t xml:space="preserve">SB454</w:t>
+            </w:r>
+          </w:p>
+        </w:tc>
+        <w:tc>
+          <w:tcPr/>
+          <w:p>
+            <w:pPr>
+              <w:pStyle w:val="Compact"/>
+            </w:pPr>
+            <w:r>
+              <w:t xml:space="preserve">laid on the table in the House; never taken back up</w:t>
             </w:r>
           </w:p>
         </w:tc>
@@ -29942,7 +32794,7 @@
         </w:numPr>
       </w:pPr>
       <w:r>
-        <w:t xml:space="preserve">2020-2024 discovery is roll-call-based: GenCourt keeps only the current biennium’s bill list, and no API key or bulk file was available for the OpenStates/LegiScan backfill in this run. Bills from 2020-2024 that died without any floor roll call are therefore missing from the set. The set under-counts failures in those years, so cross-year failure comparisons are not safe; 2025-2026 coverage is complete from the official database.</w:t>
+        <w:t xml:space="preserve">2020-2024 discovery is two-layered: (1) bills that received a floor roll call (GenCourt keeps only the current biennium’s bill list, and no API key or bulk file was available for the OpenStates/LegiScan backfill in this run); plus (2) a documented supplement of 23 bills identified in year-end official/civic indexes (NHMA Final Legislative Bulletins 2021-2024, NH OPD legislation summaries, NH Housing’s 2024 session summary, NH Bulletin roundups) and resolved against archived official dockets. Major enacted laws and prominent failures are covered; low-profile 2020-2024 bills that died quietly by voice vote may still be missing, so cross-year failure-rate comparisons remain unsafe. 2025-2026 coverage is complete from the official database.</w:t>
       </w:r>
     </w:p>
     <w:p>
@@ -30391,7 +33243,7 @@
         <w:pStyle w:val="FirstParagraph"/>
       </w:pPr>
       <w:r>
-        <w:t xml:space="preserve">612 sections; 13 housing-relevant after review. Final passage (whole bill): House 326–53 (2023-06-08).</w:t>
+        <w:t xml:space="preserve">612 sections; 14 housing-relevant after review. Final passage (whole bill): House 326–53 (2023-06-08).</w:t>
       </w:r>
     </w:p>
     <w:tbl>
@@ -30464,6 +33316,41 @@
             </w:pPr>
             <w:r>
               <w:t xml:space="preserve">Wrote the InvestNH fund and program into law - a standing fund that makes grants and loans to speed up municipal approvals and support housing construction. (InvestNH began in 2022 with federal money; this made it permanent in statute.)</w:t>
+            </w:r>
+          </w:p>
+        </w:tc>
+        <w:tc>
+          <w:tcPr/>
+          <w:p>
+            <w:pPr>
+              <w:pStyle w:val="Compact"/>
+            </w:pPr>
+            <w:r>
+              <w:t xml:space="preserve">core</w:t>
+            </w:r>
+          </w:p>
+        </w:tc>
+      </w:tr>
+      <w:tr>
+        <w:tc>
+          <w:tcPr/>
+          <w:p>
+            <w:pPr>
+              <w:pStyle w:val="Compact"/>
+            </w:pPr>
+            <w:r>
+              <w:t xml:space="preserve">79:41</w:t>
+            </w:r>
+          </w:p>
+        </w:tc>
+        <w:tc>
+          <w:tcPr/>
+          <w:p>
+            <w:pPr>
+              <w:pStyle w:val="Compact"/>
+            </w:pPr>
+            <w:r>
+              <w:t xml:space="preserve">Put $10 million into the InvestNH fund for its municipal-approval and housing-construction grants.</w:t>
             </w:r>
           </w:p>
         </w:tc>
@@ -31803,6 +34690,54 @@
               <w:pStyle w:val="Compact"/>
             </w:pPr>
             <w:r>
+              <w:t xml:space="preserve">S5b</w:t>
+            </w:r>
+          </w:p>
+        </w:tc>
+        <w:tc>
+          <w:tcPr/>
+          <w:p>
+            <w:pPr>
+              <w:pStyle w:val="Compact"/>
+            </w:pPr>
+            <w:r>
+              <w:t xml:space="preserve">Year-end official/civic indexes used for supplemental 2020–2024 discovery: NHMA Final Legislative Bulletins (2021–2024), NH OPD planning-legislation summaries and 2023 legislation matrix, NH Housing 2024 session summary, NH Bulletin and Housing Action NH session roundups; per-bill provenance in</w:t>
+            </w:r>
+            <w:r>
+              <w:t xml:space="preserve"> </w:t>
+            </w:r>
+            <w:r>
+              <w:rPr>
+                <w:rStyle w:val="VerbatimChar"/>
+              </w:rPr>
+              <w:t xml:space="preserve">pass1/bills.json</w:t>
+            </w:r>
+            <w:r>
+              <w:t xml:space="preserve"> </w:t>
+            </w:r>
+            <w:r>
+              <w:t xml:space="preserve">(</w:t>
+            </w:r>
+            <w:r>
+              <w:rPr>
+                <w:rStyle w:val="VerbatimChar"/>
+              </w:rPr>
+              <w:t xml:space="preserve">discovery_source</w:t>
+            </w:r>
+            <w:r>
+              <w:t xml:space="preserve">)</w:t>
+            </w:r>
+          </w:p>
+        </w:tc>
+      </w:tr>
+      <w:tr>
+        <w:tc>
+          <w:tcPr/>
+          <w:p>
+            <w:pPr>
+              <w:pStyle w:val="Compact"/>
+            </w:pPr>
+            <w:r>
               <w:t xml:space="preserve">S6</w:t>
             </w:r>
           </w:p>
@@ -32612,6 +35547,75 @@
       </w:r>
       <w:r>
         <w:t xml:space="preserve">known 2025 ADU law (HB577) was found missing — documented in the issue config.</w:t>
+      </w:r>
+    </w:p>
+    <w:p>
+      <w:pPr>
+        <w:pStyle w:val="Compact"/>
+        <w:numPr>
+          <w:ilvl w:val="0"/>
+          <w:numId w:val="1002"/>
+        </w:numPr>
+      </w:pPr>
+      <w:r>
+        <w:t xml:space="preserve">Supplemental discovery (S5b): 23 bills from 2020–2024 that moved only by voice</w:t>
+      </w:r>
+      <w:r>
+        <w:t xml:space="preserve"> </w:t>
+      </w:r>
+      <w:r>
+        <w:t xml:space="preserve">or division vote were identified in year-end official/civic indexes and then</w:t>
+      </w:r>
+      <w:r>
+        <w:t xml:space="preserve"> </w:t>
+      </w:r>
+      <w:r>
+        <w:t xml:space="preserve">resolved against archived official dockets and SQL roll calls</w:t>
+      </w:r>
+      <w:r>
+        <w:t xml:space="preserve"> </w:t>
+      </w:r>
+      <w:r>
+        <w:t xml:space="preserve">(</w:t>
+      </w:r>
+      <w:r>
+        <w:rPr>
+          <w:rStyle w:val="VerbatimChar"/>
+        </w:rPr>
+        <w:t xml:space="preserve">working/.../supplement-older-bills.py</w:t>
+      </w:r>
+      <w:r>
+        <w:t xml:space="preserve">). One bulletin-derived candidate</w:t>
+      </w:r>
+      <w:r>
+        <w:t xml:space="preserve"> </w:t>
+      </w:r>
+      <w:r>
+        <w:t xml:space="preserve">(2021 HB220) was found to be a non-housing bill on verification and removed.</w:t>
+      </w:r>
+    </w:p>
+    <w:p>
+      <w:pPr>
+        <w:pStyle w:val="Compact"/>
+        <w:numPr>
+          <w:ilvl w:val="0"/>
+          <w:numId w:val="1002"/>
+        </w:numPr>
+      </w:pPr>
+      <w:r>
+        <w:t xml:space="preserve">SB454’s 180–176 House tabling is a division-vote tally recorded in the official</w:t>
+      </w:r>
+      <w:r>
+        <w:t xml:space="preserve"> </w:t>
+      </w:r>
+      <w:r>
+        <w:t xml:space="preserve">docket (House Journal 12, p. 86), not a roll call; it is the only vote number</w:t>
+      </w:r>
+      <w:r>
+        <w:t xml:space="preserve"> </w:t>
+      </w:r>
+      <w:r>
+        <w:t xml:space="preserve">in the front brief that does not come from the SQL roll-call table.</w:t>
       </w:r>
     </w:p>
     <w:p>

</xml_diff>